<commit_message>
Welcome beginners without an opening assessment
</commit_message>
<xml_diff>
--- a/01_Instructor/Instructor_and_Mentor_Guide.docx
+++ b/01_Instructor/Instructor_and_Mentor_Guide.docx
@@ -2149,7 +2149,7 @@
                 <w:color w:val="000000"/>
                 <w:sz w:val="18"/>
               </w:rPr>
-              <w:t>Welcome and quick check</w:t>
+              <w:t>Welcome and introductions</w:t>
             </w:r>
           </w:p>
         </w:tc>
@@ -2179,7 +2179,7 @@
                 <w:color w:val="000000"/>
                 <w:sz w:val="18"/>
               </w:rPr>
-              <w:t>Week 1: individual baseline before coaching. Later weeks: a short recall or physical example.</w:t>
+              <w:t>Week 1: names, mentor introductions and the stop signal. Begin with curiosity and the robot demonstration. Later weeks: a short recall or physical example.</w:t>
             </w:r>
           </w:p>
         </w:tc>
@@ -3043,7 +3043,7 @@
     </w:p>
     <w:p>
       <w:r>
-        <w:t>Materials Assembled base, labeled hub, one laptop at each robot station, paper name flag, tape, ruler, printed baseline questions.</w:t>
+        <w:t>Materials Assembled base, labeled hub, one laptop at each robot station, paper name flag, tape, ruler, team sheets and build cards.</w:t>
       </w:r>
     </w:p>
     <w:p>
@@ -3054,7 +3054,922 @@
         <w:t xml:space="preserve">Before students arrive </w:t>
       </w:r>
       <w:r>
-        <w:t>Keep wheels raised for the first signal run. Open W01_signal.py in a SPIKE Prime Python project. Confirm the A/B motor mapping with the mentor smoke test. Hand out the baseline before explaining code.</w:t>
+        <w:t>Keep wheels raised for the first signal run. Open W01_signal.py in a SPIKE Prime Python project. Confirm the A/B motor mapping with the mentor smoke test. Welcome children and introduce the mentors. Prior-experience information has already been collected; use no opening quiz or ability rating.</w:t>
+      </w:r>
+    </w:p>
+    <w:tbl>
+      <w:tblPr>
+        <w:tblW w:type="auto" w:w="0"/>
+        <w:jc w:val="center"/>
+        <w:tblLayout w:type="fixed"/>
+        <w:tblLook w:firstColumn="1" w:firstRow="1" w:lastColumn="0" w:lastRow="0" w:noHBand="0" w:noVBand="1" w:val="04A0"/>
+      </w:tblPr>
+      <w:tblGrid>
+        <w:gridCol w:w="1152"/>
+        <w:gridCol w:w="9029"/>
+      </w:tblGrid>
+      <w:tr>
+        <w:trPr>
+          <w:cantSplit/>
+          <w:tblHeader/>
+        </w:trPr>
+        <w:tc>
+          <w:tcPr>
+            <w:tcW w:type="dxa" w:w="1152"/>
+            <w:vAlign w:val="center"/>
+            <w:tcBorders>
+              <w:top w:val="single" w:sz="4" w:color="D9D9D9"/>
+              <w:left w:val="single" w:sz="4" w:color="D9D9D9"/>
+              <w:bottom w:val="single" w:sz="4" w:color="D9D9D9"/>
+              <w:right w:val="single" w:sz="4" w:color="D9D9D9"/>
+            </w:tcBorders>
+            <w:shd w:fill="243E50"/>
+            <w:tcMar>
+              <w:top w:w="65" w:type="dxa"/>
+              <w:bottom w:w="65" w:type="dxa"/>
+              <w:left w:w="90" w:type="dxa"/>
+              <w:right w:w="90" w:type="dxa"/>
+            </w:tcMar>
+          </w:tcPr>
+          <w:p>
+            <w:pPr>
+              <w:spacing w:after="20" w:line="240" w:lineRule="auto"/>
+            </w:pPr>
+            <w:r>
+              <w:rPr>
+                <w:b/>
+                <w:color w:val="FFFFFF"/>
+                <w:sz w:val="18"/>
+              </w:rPr>
+              <w:t>Time</w:t>
+            </w:r>
+          </w:p>
+        </w:tc>
+        <w:tc>
+          <w:tcPr>
+            <w:tcW w:type="dxa" w:w="9029"/>
+            <w:vAlign w:val="center"/>
+            <w:tcBorders>
+              <w:top w:val="single" w:sz="4" w:color="D9D9D9"/>
+              <w:left w:val="single" w:sz="4" w:color="D9D9D9"/>
+              <w:bottom w:val="single" w:sz="4" w:color="D9D9D9"/>
+              <w:right w:val="single" w:sz="4" w:color="D9D9D9"/>
+            </w:tcBorders>
+            <w:shd w:fill="243E50"/>
+            <w:tcMar>
+              <w:top w:w="65" w:type="dxa"/>
+              <w:bottom w:w="65" w:type="dxa"/>
+              <w:left w:w="90" w:type="dxa"/>
+              <w:right w:w="90" w:type="dxa"/>
+            </w:tcMar>
+          </w:tcPr>
+          <w:p>
+            <w:pPr>
+              <w:spacing w:after="20" w:line="240" w:lineRule="auto"/>
+            </w:pPr>
+            <w:r>
+              <w:rPr>
+                <w:b/>
+                <w:color w:val="FFFFFF"/>
+                <w:sz w:val="18"/>
+              </w:rPr>
+              <w:t>Activity</w:t>
+            </w:r>
+          </w:p>
+        </w:tc>
+      </w:tr>
+      <w:tr>
+        <w:trPr>
+          <w:cantSplit/>
+        </w:trPr>
+        <w:tc>
+          <w:tcPr>
+            <w:tcW w:type="dxa" w:w="1152"/>
+            <w:tcBorders>
+              <w:top w:val="single" w:sz="4" w:color="D9D9D9"/>
+              <w:left w:val="single" w:sz="4" w:color="D9D9D9"/>
+              <w:bottom w:val="single" w:sz="4" w:color="D9D9D9"/>
+              <w:right w:val="single" w:sz="4" w:color="D9D9D9"/>
+            </w:tcBorders>
+            <w:shd w:fill="FFFFFF"/>
+            <w:tcMar>
+              <w:top w:w="65" w:type="dxa"/>
+              <w:bottom w:w="65" w:type="dxa"/>
+              <w:left w:w="90" w:type="dxa"/>
+              <w:right w:w="90" w:type="dxa"/>
+            </w:tcMar>
+          </w:tcPr>
+          <w:p>
+            <w:pPr>
+              <w:spacing w:after="20" w:line="240" w:lineRule="auto"/>
+            </w:pPr>
+            <w:r>
+              <w:rPr>
+                <w:color w:val="000000"/>
+                <w:sz w:val="18"/>
+              </w:rPr>
+              <w:t>0–5</w:t>
+            </w:r>
+          </w:p>
+        </w:tc>
+        <w:tc>
+          <w:tcPr>
+            <w:tcW w:type="dxa" w:w="9029"/>
+            <w:tcBorders>
+              <w:top w:val="single" w:sz="4" w:color="D9D9D9"/>
+              <w:left w:val="single" w:sz="4" w:color="D9D9D9"/>
+              <w:bottom w:val="single" w:sz="4" w:color="D9D9D9"/>
+              <w:right w:val="single" w:sz="4" w:color="D9D9D9"/>
+            </w:tcBorders>
+            <w:shd w:fill="FFFFFF"/>
+            <w:tcMar>
+              <w:top w:w="65" w:type="dxa"/>
+              <w:bottom w:w="65" w:type="dxa"/>
+              <w:left w:w="90" w:type="dxa"/>
+              <w:right w:w="90" w:type="dxa"/>
+            </w:tcMar>
+          </w:tcPr>
+          <w:p>
+            <w:pPr>
+              <w:spacing w:after="20" w:line="240" w:lineRule="auto"/>
+            </w:pPr>
+            <w:r>
+              <w:rPr>
+                <w:color w:val="000000"/>
+                <w:sz w:val="18"/>
+              </w:rPr>
+              <w:t>Welcome and introductions</w:t>
+            </w:r>
+          </w:p>
+        </w:tc>
+      </w:tr>
+      <w:tr>
+        <w:trPr>
+          <w:cantSplit/>
+        </w:trPr>
+        <w:tc>
+          <w:tcPr>
+            <w:tcW w:type="dxa" w:w="1152"/>
+            <w:tcBorders>
+              <w:top w:val="single" w:sz="4" w:color="D9D9D9"/>
+              <w:left w:val="single" w:sz="4" w:color="D9D9D9"/>
+              <w:bottom w:val="single" w:sz="4" w:color="D9D9D9"/>
+              <w:right w:val="single" w:sz="4" w:color="D9D9D9"/>
+            </w:tcBorders>
+            <w:shd w:fill="F2F5F6"/>
+            <w:tcMar>
+              <w:top w:w="65" w:type="dxa"/>
+              <w:bottom w:w="65" w:type="dxa"/>
+              <w:left w:w="90" w:type="dxa"/>
+              <w:right w:w="90" w:type="dxa"/>
+            </w:tcMar>
+          </w:tcPr>
+          <w:p>
+            <w:pPr>
+              <w:spacing w:after="20" w:line="240" w:lineRule="auto"/>
+            </w:pPr>
+            <w:r>
+              <w:rPr>
+                <w:color w:val="000000"/>
+                <w:sz w:val="18"/>
+              </w:rPr>
+              <w:t>5–10</w:t>
+            </w:r>
+          </w:p>
+        </w:tc>
+        <w:tc>
+          <w:tcPr>
+            <w:tcW w:type="dxa" w:w="9029"/>
+            <w:tcBorders>
+              <w:top w:val="single" w:sz="4" w:color="D9D9D9"/>
+              <w:left w:val="single" w:sz="4" w:color="D9D9D9"/>
+              <w:bottom w:val="single" w:sz="4" w:color="D9D9D9"/>
+              <w:right w:val="single" w:sz="4" w:color="D9D9D9"/>
+            </w:tcBorders>
+            <w:shd w:fill="F2F5F6"/>
+            <w:tcMar>
+              <w:top w:w="65" w:type="dxa"/>
+              <w:bottom w:w="65" w:type="dxa"/>
+              <w:left w:w="90" w:type="dxa"/>
+              <w:right w:w="90" w:type="dxa"/>
+            </w:tcMar>
+          </w:tcPr>
+          <w:p>
+            <w:pPr>
+              <w:spacing w:after="20" w:line="240" w:lineRule="auto"/>
+            </w:pPr>
+            <w:r>
+              <w:rPr>
+                <w:color w:val="000000"/>
+                <w:sz w:val="18"/>
+              </w:rPr>
+              <w:t>Robot demonstration</w:t>
+            </w:r>
+          </w:p>
+        </w:tc>
+      </w:tr>
+      <w:tr>
+        <w:trPr>
+          <w:cantSplit/>
+        </w:trPr>
+        <w:tc>
+          <w:tcPr>
+            <w:tcW w:type="dxa" w:w="1152"/>
+            <w:tcBorders>
+              <w:top w:val="single" w:sz="4" w:color="D9D9D9"/>
+              <w:left w:val="single" w:sz="4" w:color="D9D9D9"/>
+              <w:bottom w:val="single" w:sz="4" w:color="D9D9D9"/>
+              <w:right w:val="single" w:sz="4" w:color="D9D9D9"/>
+            </w:tcBorders>
+            <w:shd w:fill="FFFFFF"/>
+            <w:tcMar>
+              <w:top w:w="65" w:type="dxa"/>
+              <w:bottom w:w="65" w:type="dxa"/>
+              <w:left w:w="90" w:type="dxa"/>
+              <w:right w:w="90" w:type="dxa"/>
+            </w:tcMar>
+          </w:tcPr>
+          <w:p>
+            <w:pPr>
+              <w:spacing w:after="20" w:line="240" w:lineRule="auto"/>
+            </w:pPr>
+            <w:r>
+              <w:rPr>
+                <w:color w:val="000000"/>
+                <w:sz w:val="18"/>
+              </w:rPr>
+              <w:t>10–14</w:t>
+            </w:r>
+          </w:p>
+        </w:tc>
+        <w:tc>
+          <w:tcPr>
+            <w:tcW w:type="dxa" w:w="9029"/>
+            <w:tcBorders>
+              <w:top w:val="single" w:sz="4" w:color="D9D9D9"/>
+              <w:left w:val="single" w:sz="4" w:color="D9D9D9"/>
+              <w:bottom w:val="single" w:sz="4" w:color="D9D9D9"/>
+              <w:right w:val="single" w:sz="4" w:color="D9D9D9"/>
+            </w:tcBorders>
+            <w:shd w:fill="FFFFFF"/>
+            <w:tcMar>
+              <w:top w:w="65" w:type="dxa"/>
+              <w:bottom w:w="65" w:type="dxa"/>
+              <w:left w:w="90" w:type="dxa"/>
+              <w:right w:w="90" w:type="dxa"/>
+            </w:tcMar>
+          </w:tcPr>
+          <w:p>
+            <w:pPr>
+              <w:spacing w:after="20" w:line="240" w:lineRule="auto"/>
+            </w:pPr>
+            <w:r>
+              <w:rPr>
+                <w:color w:val="000000"/>
+                <w:sz w:val="18"/>
+              </w:rPr>
+              <w:t>Code and prediction</w:t>
+            </w:r>
+          </w:p>
+        </w:tc>
+      </w:tr>
+      <w:tr>
+        <w:trPr>
+          <w:cantSplit/>
+        </w:trPr>
+        <w:tc>
+          <w:tcPr>
+            <w:tcW w:type="dxa" w:w="1152"/>
+            <w:tcBorders>
+              <w:top w:val="single" w:sz="4" w:color="D9D9D9"/>
+              <w:left w:val="single" w:sz="4" w:color="D9D9D9"/>
+              <w:bottom w:val="single" w:sz="4" w:color="D9D9D9"/>
+              <w:right w:val="single" w:sz="4" w:color="D9D9D9"/>
+            </w:tcBorders>
+            <w:shd w:fill="F2F5F6"/>
+            <w:tcMar>
+              <w:top w:w="65" w:type="dxa"/>
+              <w:bottom w:w="65" w:type="dxa"/>
+              <w:left w:w="90" w:type="dxa"/>
+              <w:right w:w="90" w:type="dxa"/>
+            </w:tcMar>
+          </w:tcPr>
+          <w:p>
+            <w:pPr>
+              <w:spacing w:after="20" w:line="240" w:lineRule="auto"/>
+            </w:pPr>
+            <w:r>
+              <w:rPr>
+                <w:color w:val="000000"/>
+                <w:sz w:val="18"/>
+              </w:rPr>
+              <w:t>14–26</w:t>
+            </w:r>
+          </w:p>
+        </w:tc>
+        <w:tc>
+          <w:tcPr>
+            <w:tcW w:type="dxa" w:w="9029"/>
+            <w:tcBorders>
+              <w:top w:val="single" w:sz="4" w:color="D9D9D9"/>
+              <w:left w:val="single" w:sz="4" w:color="D9D9D9"/>
+              <w:bottom w:val="single" w:sz="4" w:color="D9D9D9"/>
+              <w:right w:val="single" w:sz="4" w:color="D9D9D9"/>
+            </w:tcBorders>
+            <w:shd w:fill="F2F5F6"/>
+            <w:tcMar>
+              <w:top w:w="65" w:type="dxa"/>
+              <w:bottom w:w="65" w:type="dxa"/>
+              <w:left w:w="90" w:type="dxa"/>
+              <w:right w:w="90" w:type="dxa"/>
+            </w:tcMar>
+          </w:tcPr>
+          <w:p>
+            <w:pPr>
+              <w:spacing w:after="20" w:line="240" w:lineRule="auto"/>
+            </w:pPr>
+            <w:r>
+              <w:rPr>
+                <w:color w:val="000000"/>
+                <w:sz w:val="18"/>
+              </w:rPr>
+              <w:t>First rotation</w:t>
+            </w:r>
+          </w:p>
+        </w:tc>
+      </w:tr>
+      <w:tr>
+        <w:trPr>
+          <w:cantSplit/>
+        </w:trPr>
+        <w:tc>
+          <w:tcPr>
+            <w:tcW w:type="dxa" w:w="1152"/>
+            <w:tcBorders>
+              <w:top w:val="single" w:sz="4" w:color="D9D9D9"/>
+              <w:left w:val="single" w:sz="4" w:color="D9D9D9"/>
+              <w:bottom w:val="single" w:sz="4" w:color="D9D9D9"/>
+              <w:right w:val="single" w:sz="4" w:color="D9D9D9"/>
+            </w:tcBorders>
+            <w:shd w:fill="FFFFFF"/>
+            <w:tcMar>
+              <w:top w:w="65" w:type="dxa"/>
+              <w:bottom w:w="65" w:type="dxa"/>
+              <w:left w:w="90" w:type="dxa"/>
+              <w:right w:w="90" w:type="dxa"/>
+            </w:tcMar>
+          </w:tcPr>
+          <w:p>
+            <w:pPr>
+              <w:spacing w:after="20" w:line="240" w:lineRule="auto"/>
+            </w:pPr>
+            <w:r>
+              <w:rPr>
+                <w:color w:val="000000"/>
+                <w:sz w:val="18"/>
+              </w:rPr>
+              <w:t>26–38</w:t>
+            </w:r>
+          </w:p>
+        </w:tc>
+        <w:tc>
+          <w:tcPr>
+            <w:tcW w:type="dxa" w:w="9029"/>
+            <w:tcBorders>
+              <w:top w:val="single" w:sz="4" w:color="D9D9D9"/>
+              <w:left w:val="single" w:sz="4" w:color="D9D9D9"/>
+              <w:bottom w:val="single" w:sz="4" w:color="D9D9D9"/>
+              <w:right w:val="single" w:sz="4" w:color="D9D9D9"/>
+            </w:tcBorders>
+            <w:shd w:fill="FFFFFF"/>
+            <w:tcMar>
+              <w:top w:w="65" w:type="dxa"/>
+              <w:bottom w:w="65" w:type="dxa"/>
+              <w:left w:w="90" w:type="dxa"/>
+              <w:right w:w="90" w:type="dxa"/>
+            </w:tcMar>
+          </w:tcPr>
+          <w:p>
+            <w:pPr>
+              <w:spacing w:after="20" w:line="240" w:lineRule="auto"/>
+            </w:pPr>
+            <w:r>
+              <w:rPr>
+                <w:color w:val="000000"/>
+                <w:sz w:val="18"/>
+              </w:rPr>
+              <w:t>Second rotation</w:t>
+            </w:r>
+          </w:p>
+        </w:tc>
+      </w:tr>
+      <w:tr>
+        <w:trPr>
+          <w:cantSplit/>
+        </w:trPr>
+        <w:tc>
+          <w:tcPr>
+            <w:tcW w:type="dxa" w:w="1152"/>
+            <w:tcBorders>
+              <w:top w:val="single" w:sz="4" w:color="D9D9D9"/>
+              <w:left w:val="single" w:sz="4" w:color="D9D9D9"/>
+              <w:bottom w:val="single" w:sz="4" w:color="D9D9D9"/>
+              <w:right w:val="single" w:sz="4" w:color="D9D9D9"/>
+            </w:tcBorders>
+            <w:shd w:fill="F2F5F6"/>
+            <w:tcMar>
+              <w:top w:w="65" w:type="dxa"/>
+              <w:bottom w:w="65" w:type="dxa"/>
+              <w:left w:w="90" w:type="dxa"/>
+              <w:right w:w="90" w:type="dxa"/>
+            </w:tcMar>
+          </w:tcPr>
+          <w:p>
+            <w:pPr>
+              <w:spacing w:after="20" w:line="240" w:lineRule="auto"/>
+            </w:pPr>
+            <w:r>
+              <w:rPr>
+                <w:color w:val="000000"/>
+                <w:sz w:val="18"/>
+              </w:rPr>
+              <w:t>38–44</w:t>
+            </w:r>
+          </w:p>
+        </w:tc>
+        <w:tc>
+          <w:tcPr>
+            <w:tcW w:type="dxa" w:w="9029"/>
+            <w:tcBorders>
+              <w:top w:val="single" w:sz="4" w:color="D9D9D9"/>
+              <w:left w:val="single" w:sz="4" w:color="D9D9D9"/>
+              <w:bottom w:val="single" w:sz="4" w:color="D9D9D9"/>
+              <w:right w:val="single" w:sz="4" w:color="D9D9D9"/>
+            </w:tcBorders>
+            <w:shd w:fill="F2F5F6"/>
+            <w:tcMar>
+              <w:top w:w="65" w:type="dxa"/>
+              <w:bottom w:w="65" w:type="dxa"/>
+              <w:left w:w="90" w:type="dxa"/>
+              <w:right w:w="90" w:type="dxa"/>
+            </w:tcMar>
+          </w:tcPr>
+          <w:p>
+            <w:pPr>
+              <w:spacing w:after="20" w:line="240" w:lineRule="auto"/>
+            </w:pPr>
+            <w:r>
+              <w:rPr>
+                <w:color w:val="000000"/>
+                <w:sz w:val="18"/>
+              </w:rPr>
+              <w:t>First retest</w:t>
+            </w:r>
+          </w:p>
+        </w:tc>
+      </w:tr>
+      <w:tr>
+        <w:trPr>
+          <w:cantSplit/>
+        </w:trPr>
+        <w:tc>
+          <w:tcPr>
+            <w:tcW w:type="dxa" w:w="1152"/>
+            <w:tcBorders>
+              <w:top w:val="single" w:sz="4" w:color="D9D9D9"/>
+              <w:left w:val="single" w:sz="4" w:color="D9D9D9"/>
+              <w:bottom w:val="single" w:sz="4" w:color="D9D9D9"/>
+              <w:right w:val="single" w:sz="4" w:color="D9D9D9"/>
+            </w:tcBorders>
+            <w:shd w:fill="FFFFFF"/>
+            <w:tcMar>
+              <w:top w:w="65" w:type="dxa"/>
+              <w:bottom w:w="65" w:type="dxa"/>
+              <w:left w:w="90" w:type="dxa"/>
+              <w:right w:w="90" w:type="dxa"/>
+            </w:tcMar>
+          </w:tcPr>
+          <w:p>
+            <w:pPr>
+              <w:spacing w:after="20" w:line="240" w:lineRule="auto"/>
+            </w:pPr>
+            <w:r>
+              <w:rPr>
+                <w:color w:val="000000"/>
+                <w:sz w:val="18"/>
+              </w:rPr>
+              <w:t>44–50</w:t>
+            </w:r>
+          </w:p>
+        </w:tc>
+        <w:tc>
+          <w:tcPr>
+            <w:tcW w:type="dxa" w:w="9029"/>
+            <w:tcBorders>
+              <w:top w:val="single" w:sz="4" w:color="D9D9D9"/>
+              <w:left w:val="single" w:sz="4" w:color="D9D9D9"/>
+              <w:bottom w:val="single" w:sz="4" w:color="D9D9D9"/>
+              <w:right w:val="single" w:sz="4" w:color="D9D9D9"/>
+            </w:tcBorders>
+            <w:shd w:fill="FFFFFF"/>
+            <w:tcMar>
+              <w:top w:w="65" w:type="dxa"/>
+              <w:bottom w:w="65" w:type="dxa"/>
+              <w:left w:w="90" w:type="dxa"/>
+              <w:right w:w="90" w:type="dxa"/>
+            </w:tcMar>
+          </w:tcPr>
+          <w:p>
+            <w:pPr>
+              <w:spacing w:after="20" w:line="240" w:lineRule="auto"/>
+            </w:pPr>
+            <w:r>
+              <w:rPr>
+                <w:color w:val="000000"/>
+                <w:sz w:val="18"/>
+              </w:rPr>
+              <w:t>Second retest</w:t>
+            </w:r>
+          </w:p>
+        </w:tc>
+      </w:tr>
+      <w:tr>
+        <w:trPr>
+          <w:cantSplit/>
+        </w:trPr>
+        <w:tc>
+          <w:tcPr>
+            <w:tcW w:type="dxa" w:w="1152"/>
+            <w:tcBorders>
+              <w:top w:val="single" w:sz="4" w:color="D9D9D9"/>
+              <w:left w:val="single" w:sz="4" w:color="D9D9D9"/>
+              <w:bottom w:val="single" w:sz="4" w:color="D9D9D9"/>
+              <w:right w:val="single" w:sz="4" w:color="D9D9D9"/>
+            </w:tcBorders>
+            <w:shd w:fill="F2F5F6"/>
+            <w:tcMar>
+              <w:top w:w="65" w:type="dxa"/>
+              <w:bottom w:w="65" w:type="dxa"/>
+              <w:left w:w="90" w:type="dxa"/>
+              <w:right w:w="90" w:type="dxa"/>
+            </w:tcMar>
+          </w:tcPr>
+          <w:p>
+            <w:pPr>
+              <w:spacing w:after="20" w:line="240" w:lineRule="auto"/>
+            </w:pPr>
+            <w:r>
+              <w:rPr>
+                <w:color w:val="000000"/>
+                <w:sz w:val="18"/>
+              </w:rPr>
+              <w:t>50–54</w:t>
+            </w:r>
+          </w:p>
+        </w:tc>
+        <w:tc>
+          <w:tcPr>
+            <w:tcW w:type="dxa" w:w="9029"/>
+            <w:tcBorders>
+              <w:top w:val="single" w:sz="4" w:color="D9D9D9"/>
+              <w:left w:val="single" w:sz="4" w:color="D9D9D9"/>
+              <w:bottom w:val="single" w:sz="4" w:color="D9D9D9"/>
+              <w:right w:val="single" w:sz="4" w:color="D9D9D9"/>
+            </w:tcBorders>
+            <w:shd w:fill="F2F5F6"/>
+            <w:tcMar>
+              <w:top w:w="65" w:type="dxa"/>
+              <w:bottom w:w="65" w:type="dxa"/>
+              <w:left w:w="90" w:type="dxa"/>
+              <w:right w:w="90" w:type="dxa"/>
+            </w:tcMar>
+          </w:tcPr>
+          <w:p>
+            <w:pPr>
+              <w:spacing w:after="20" w:line="240" w:lineRule="auto"/>
+            </w:pPr>
+            <w:r>
+              <w:rPr>
+                <w:color w:val="000000"/>
+                <w:sz w:val="18"/>
+              </w:rPr>
+              <w:t>Learning and observations</w:t>
+            </w:r>
+          </w:p>
+        </w:tc>
+      </w:tr>
+      <w:tr>
+        <w:trPr>
+          <w:cantSplit/>
+        </w:trPr>
+        <w:tc>
+          <w:tcPr>
+            <w:tcW w:type="dxa" w:w="1152"/>
+            <w:tcBorders>
+              <w:top w:val="single" w:sz="4" w:color="D9D9D9"/>
+              <w:left w:val="single" w:sz="4" w:color="D9D9D9"/>
+              <w:bottom w:val="single" w:sz="4" w:color="D9D9D9"/>
+              <w:right w:val="single" w:sz="4" w:color="D9D9D9"/>
+            </w:tcBorders>
+            <w:shd w:fill="FFFFFF"/>
+            <w:tcMar>
+              <w:top w:w="65" w:type="dxa"/>
+              <w:bottom w:w="65" w:type="dxa"/>
+              <w:left w:w="90" w:type="dxa"/>
+              <w:right w:w="90" w:type="dxa"/>
+            </w:tcMar>
+          </w:tcPr>
+          <w:p>
+            <w:pPr>
+              <w:spacing w:after="20" w:line="240" w:lineRule="auto"/>
+            </w:pPr>
+            <w:r>
+              <w:rPr>
+                <w:color w:val="000000"/>
+                <w:sz w:val="18"/>
+              </w:rPr>
+              <w:t>54–60</w:t>
+            </w:r>
+          </w:p>
+        </w:tc>
+        <w:tc>
+          <w:tcPr>
+            <w:tcW w:type="dxa" w:w="9029"/>
+            <w:tcBorders>
+              <w:top w:val="single" w:sz="4" w:color="D9D9D9"/>
+              <w:left w:val="single" w:sz="4" w:color="D9D9D9"/>
+              <w:bottom w:val="single" w:sz="4" w:color="D9D9D9"/>
+              <w:right w:val="single" w:sz="4" w:color="D9D9D9"/>
+            </w:tcBorders>
+            <w:shd w:fill="FFFFFF"/>
+            <w:tcMar>
+              <w:top w:w="65" w:type="dxa"/>
+              <w:bottom w:w="65" w:type="dxa"/>
+              <w:left w:w="90" w:type="dxa"/>
+              <w:right w:w="90" w:type="dxa"/>
+            </w:tcMar>
+          </w:tcPr>
+          <w:p>
+            <w:pPr>
+              <w:spacing w:after="20" w:line="240" w:lineRule="auto"/>
+            </w:pPr>
+            <w:r>
+              <w:rPr>
+                <w:color w:val="000000"/>
+                <w:sz w:val="18"/>
+              </w:rPr>
+              <w:t>Save and reset</w:t>
+            </w:r>
+          </w:p>
+        </w:tc>
+      </w:tr>
+    </w:tbl>
+    <w:p>
+      <w:pPr>
+        <w:spacing w:after="0"/>
+      </w:pPr>
+    </w:p>
+    <w:p>
+      <w:r>
+        <w:rPr>
+          <w:b/>
+        </w:rPr>
+        <w:t xml:space="preserve">Opening prompt </w:t>
+      </w:r>
+      <w:r>
+        <w:t>Where could a robot help at a community center? Accept practical or playful ideas. Ask what the robot must be told before it can help.</w:t>
+      </w:r>
+    </w:p>
+    <w:p>
+      <w:r>
+        <w:rPr>
+          <w:b/>
+        </w:rPr>
+        <w:t xml:space="preserve">Demonstration </w:t>
+      </w:r>
+      <w:r>
+        <w:t>Run a letter followed by a pause and a short move. Point at the matching line as each action occurs. Say: “Python is text that tells the robot what to do. Today you only change the recipe area.”</w:t>
+      </w:r>
+    </w:p>
+    <w:p>
+      <w:pPr>
+        <w:keepLines/>
+        <w:spacing w:before="80" w:after="120"/>
+      </w:pPr>
+      <w:r>
+        <w:rPr>
+          <w:rFonts w:ascii="Consolas" w:hAnsi="Consolas"/>
+          <w:sz w:val="20"/>
+        </w:rPr>
+        <w:t>await signal("Y")</w:t>
+      </w:r>
+      <w:r>
+        <w:rPr>
+          <w:rFonts w:ascii="Consolas" w:hAnsi="Consolas"/>
+          <w:sz w:val="20"/>
+        </w:rPr>
+        <w:br/>
+        <w:t>await pause(500)</w:t>
+      </w:r>
+      <w:r>
+        <w:rPr>
+          <w:rFonts w:ascii="Consolas" w:hAnsi="Consolas"/>
+          <w:sz w:val="20"/>
+        </w:rPr>
+        <w:br/>
+        <w:t>await drive(90)</w:t>
+      </w:r>
+    </w:p>
+    <w:p>
+      <w:r>
+        <w:rPr>
+          <w:b/>
+        </w:rPr>
+        <w:t xml:space="preserve">Code note </w:t>
+      </w:r>
+      <w:r>
+        <w:t>The code above is a discussion fragment. Run the complete supplied week file. Hardware setup and support functions are already included.</w:t>
+      </w:r>
+    </w:p>
+    <w:p>
+      <w:r/>
+    </w:p>
+    <w:p>
+      <w:pPr>
+        <w:pStyle w:val="Heading1"/>
+        <w:pageBreakBefore/>
+      </w:pPr>
+      <w:r>
+        <w:t>Week 1 facilitation steps</w:t>
+      </w:r>
+    </w:p>
+    <w:p>
+      <w:r>
+        <w:rPr>
+          <w:b/>
+        </w:rPr>
+        <w:t xml:space="preserve">1. </w:t>
+      </w:r>
+      <w:r>
+        <w:t>Name the hub and locate its ports. Point out the two motors, wheels, rechargeable hub, and display. Keep the chassis assembled. Add a removable paper name flag that clears wheels and ports.</w:t>
+      </w:r>
+    </w:p>
+    <w:p>
+      <w:r>
+        <w:t>2. Open the supplied project. Find STUDENT RECIPE inside student_recipe. Change Y to one letter chosen by the team. Keep quotation marks. Run with wheels raised, then point to the changed line.</w:t>
+      </w:r>
+    </w:p>
+    <w:p>
+      <w:r>
+        <w:rPr>
+          <w:b/>
+        </w:rPr>
+        <w:t xml:space="preserve">3. </w:t>
+      </w:r>
+      <w:r>
+        <w:t>Place the robot at a taped start in a clear lane. Navigator checks that the lane is empty. Driver starts the program. Observe which action happens first and mark the endpoint.</w:t>
+      </w:r>
+    </w:p>
+    <w:p>
+      <w:r>
+        <w:rPr>
+          <w:b/>
+        </w:rPr>
+        <w:t xml:space="preserve">4. </w:t>
+      </w:r>
+      <w:r>
+        <w:t>Switch roles. Change the pause from 500 to 1000 milliseconds. Predict the difference and run again. Keep drive at 90 wheel degrees.</w:t>
+      </w:r>
+    </w:p>
+    <w:p>
+      <w:r>
+        <w:t>5. During the final six-minute turn, reorder signal and pause or choose a different letter. Each student explains one line without the mentor answering for them.</w:t>
+      </w:r>
+    </w:p>
+    <w:p>
+      <w:r>
+        <w:t>Build activity  A removable robot mascot. Make a name flag or face that stays upright and attaches without covering a wheel, port, button or cable. Choose a team name and lay out a lightweight mast or face. Build a wide or braced support using the mounting template. Gently tilt and tap the model by hand. Improve one weak connection. Test: Stands after a gentle tap; stays inside the clearance template; no loose parts. Fit the approved mascot to the stopped base for the retest. The first robot teams use a mentor example or the bare base.</w:t>
+      </w:r>
+    </w:p>
+    <w:p>
+      <w:r>
+        <w:t>Support Mentor highlights only the three recipe lines. Students may point or dictate while their teammate types, then swap the explanation role. Accept a correct light sequence if movement is delayed.</w:t>
+      </w:r>
+    </w:p>
+    <w:p>
+      <w:r>
+        <w:rPr>
+          <w:b/>
+        </w:rPr>
+        <w:t xml:space="preserve">Optional extension </w:t>
+      </w:r>
+      <w:r>
+        <w:t>Add a second signal and explain why its location in the sequence matters. No speed contest.</w:t>
+      </w:r>
+    </w:p>
+    <w:p>
+      <w:r>
+        <w:rPr>
+          <w:b/>
+        </w:rPr>
+        <w:t xml:space="preserve">Troubleshooting </w:t>
+      </w:r>
+      <w:r>
+        <w:t>No letter: check hub connection and that the program started. SyntaxError: check the quotation marks and indentation. Wrong motion: stop and check the A/B cables and base orientation before changing code.</w:t>
+      </w:r>
+    </w:p>
+    <w:p>
+      <w:r>
+        <w:rPr>
+          <w:b/>
+        </w:rPr>
+        <w:t xml:space="preserve">Word Blocks equivalent </w:t>
+      </w:r>
+      <w:r>
+        <w:t>New Word Blocks project: when program starts; display chosen text on hub; wait 0.5 seconds; move straight for 0.25 rotations at a mentor-tested slow speed. Set movement motors to A and B. Compare the same action order.</w:t>
+      </w:r>
+    </w:p>
+    <w:p>
+      <w:r>
+        <w:rPr>
+          <w:b/>
+        </w:rPr>
+        <w:t xml:space="preserve">Evidence to keep </w:t>
+      </w:r>
+      <w:r>
+        <w:t>Record the letter, pause value, predicted order, and observed order. Individual exit: “A program is ___, and the line I changed made ___ happen.”</w:t>
+      </w:r>
+    </w:p>
+    <w:p>
+      <w:r>
+        <w:rPr>
+          <w:b/>
+        </w:rPr>
+        <w:t xml:space="preserve">Expected reasoning </w:t>
+      </w:r>
+      <w:r>
+        <w:t>Show Y, wait, then drive. A longer pause changes waiting time, not the drive distance. A signal-only run still demonstrates sequence.</w:t>
+      </w:r>
+    </w:p>
+    <w:p>
+      <w:r/>
+    </w:p>
+    <w:p>
+      <w:pPr>
+        <w:pStyle w:val="Heading1"/>
+        <w:pageBreakBefore/>
+      </w:pPr>
+      <w:r>
+        <w:t>Week 2 Delivery to a target</w:t>
+      </w:r>
+    </w:p>
+    <w:p>
+      <w:r>
+        <w:rPr>
+          <w:b/>
+        </w:rPr>
+        <w:t xml:space="preserve">Mission </w:t>
+      </w:r>
+      <w:r>
+        <w:t>A variable controls travel</w:t>
+      </w:r>
+    </w:p>
+    <w:p>
+      <w:r>
+        <w:rPr>
+          <w:b/>
+        </w:rPr>
+        <w:t xml:space="preserve">Learning objective </w:t>
+      </w:r>
+      <w:r>
+        <w:t>Each student changes a named distance value and uses a measurement to justify the next change.</w:t>
+      </w:r>
+    </w:p>
+    <w:p>
+      <w:r>
+        <w:t>Minimum success The team makes three recorded trials and attempts to stop the front of the robot within 5 cm of a 40 cm target. A justified adjustment counts even if precision remains imperfect.</w:t>
+      </w:r>
+    </w:p>
+    <w:p>
+      <w:r>
+        <w:rPr>
+          <w:b/>
+        </w:rPr>
+        <w:t xml:space="preserve">Materials </w:t>
+      </w:r>
+      <w:r>
+        <w:t>Base, measuring tape, floor-safe tape, 40 cm target measured from the same front bumper reference, test log.</w:t>
+      </w:r>
+    </w:p>
+    <w:p>
+      <w:r>
+        <w:rPr>
+          <w:b/>
+        </w:rPr>
+        <w:t xml:space="preserve">Before students arrive </w:t>
+      </w:r>
+      <w:r>
+        <w:t>Open W02_delivery.py. Set a 100 cm clear lane with a 40 cm goal and extra stopping space. Check front-edge start marks. Use 180, then 360 wheel degrees as trial values. Keep SPEED at 200.</w:t>
       </w:r>
     </w:p>
     <w:tbl>
@@ -3737,7 +4652,7 @@
         <w:t xml:space="preserve">Opening prompt </w:t>
       </w:r>
       <w:r>
-        <w:t>Where could a robot help at a community center? Accept practical or playful ideas. Ask what the robot must be told before it can help.</w:t>
+        <w:t>A delivery cart must reach a shelf. Is guessing enough if it has to make the trip again tomorrow?</w:t>
       </w:r>
     </w:p>
     <w:p>
@@ -3748,7 +4663,7 @@
         <w:t xml:space="preserve">Demonstration </w:t>
       </w:r>
       <w:r>
-        <w:t>Run a letter followed by a pause and a short move. Point at the matching line as each action occurs. Say: “Python is text that tells the robot what to do. Today you only change the recipe area.”</w:t>
+        <w:t>Show travel = 180 and explain that travel names a value. Measure the distance of one run. Change only travel. Motor degrees describe wheel rotation, not centimeters or the robot’s heading.</w:t>
       </w:r>
     </w:p>
     <w:p>
@@ -3761,7 +4676,7 @@
           <w:rFonts w:ascii="Consolas" w:hAnsi="Consolas"/>
           <w:sz w:val="20"/>
         </w:rPr>
-        <w:t>await signal("Y")</w:t>
+        <w:t>travel = 180</w:t>
       </w:r>
       <w:r>
         <w:rPr>
@@ -3769,7 +4684,7 @@
           <w:sz w:val="20"/>
         </w:rPr>
         <w:br/>
-        <w:t>await pause(500)</w:t>
+        <w:t>await drive(travel)</w:t>
       </w:r>
       <w:r>
         <w:rPr>
@@ -3777,7 +4692,7 @@
           <w:sz w:val="20"/>
         </w:rPr>
         <w:br/>
-        <w:t>await drive(90)</w:t>
+        <w:t>await signal("D")</w:t>
       </w:r>
     </w:p>
     <w:p>
@@ -3800,7 +4715,7 @@
         <w:pageBreakBefore/>
       </w:pPr>
       <w:r>
-        <w:t>Week 1 facilitation steps</w:t>
+        <w:t>Week 2 facilitation steps</w:t>
       </w:r>
     </w:p>
     <w:p>
@@ -3811,12 +4726,18 @@
         <w:t xml:space="preserve">1. </w:t>
       </w:r>
       <w:r>
-        <w:t>Name the hub and locate its ports. Point out the two motors, wheels, rechargeable hub, and display. Keep the chassis assembled. Add a removable paper name flag that clears wheels and ports.</w:t>
+        <w:t>Align the same front edge with the start tape every time. Run travel = 180. Measure front-edge displacement in centimeters and enter it in the log.</w:t>
       </w:r>
     </w:p>
     <w:p>
       <w:r>
-        <w:t>2. Open the supplied project. Find STUDENT RECIPE inside student_recipe. Change Y to one letter chosen by the team. Keep quotation marks. Run with wheels raised, then point to the changed line.</w:t>
+        <w:rPr>
+          <w:b/>
+        </w:rPr>
+        <w:t xml:space="preserve">2. </w:t>
+      </w:r>
+      <w:r>
+        <w:t>Swap driver. Predict and run travel = 360. Keep the robot, floor, starting angle, and speed the same. Compare the two measurements.</w:t>
       </w:r>
     </w:p>
     <w:p>
@@ -3827,7 +4748,7 @@
         <w:t xml:space="preserve">3. </w:t>
       </w:r>
       <w:r>
-        <w:t>Place the robot at a taped start in a clear lane. Navigator checks that the lane is empty. Driver starts the program. Observe which action happens first and mark the endpoint.</w:t>
+        <w:t>Estimate a value for a 40 cm delivery using the measured result. Example only: if 360 gave 18 cm, 40 / 18 × 360 is about 800. The drive helper permits up to 1080 degrees. Use your own result.</w:t>
       </w:r>
     </w:p>
     <w:p>
@@ -3838,22 +4759,28 @@
         <w:t xml:space="preserve">4. </w:t>
       </w:r>
       <w:r>
-        <w:t>Switch roles. Change the pause from 500 to 1000 milliseconds. Predict the difference and run again. Keep drive at 90 wheel degrees.</w:t>
+        <w:t>During the final turn, test the estimate. Record signed error as measured distance minus 40. If it overshoots, reduce travel. If it stops short, increase travel.</w:t>
       </w:r>
     </w:p>
     <w:p>
       <w:r>
-        <w:t>5. During the final six-minute turn, reorder signal and pause or choose a different letter. Each student explains one line without the mentor answering for them.</w:t>
+        <w:t>5. Explain one reason two identical runs might differ, such as a crooked start or wheel slip. Park the robot and save the team’s best value.</w:t>
       </w:r>
     </w:p>
     <w:p>
       <w:r>
-        <w:t>Build activity  A removable robot mascot. Make a name flag or face that stays upright and attaches without covering a wheel, port, button or cable. Choose a team name and lay out a lightweight mast or face. Build a wide or braced support using the mounting template. Gently tilt and tap the model by hand. Improve one weak connection. Test: Stands after a gentle tap; stays inside the clearance template; no loose parts. Fit the approved mascot to the stopped base for the retest. The first robot teams use a mentor example or the bare base.</w:t>
+        <w:t>Build activity  A cargo tray that keeps its load. Build a removable tray or cradle with an edge that keeps the cube aboard. Choose where the cube will sit and build a flat support. Add an edge or rail without making the tray touch the floor or wheels. Tilt the tray gently by hand and compare one change to its edge. Test: Cube stays in the tray during a gentle tilt; tray does not sag into a wheel. A mentor supplies an example tray for the first robot turn. Keep payload and tray unchanged during each distance comparison; test the team tray during the retest.</w:t>
       </w:r>
     </w:p>
     <w:p>
       <w:r>
-        <w:t>Support Mentor highlights only the three recipe lines. Students may point or dictate while their teammate types, then swap the explanation role. Accept a correct light sequence if movement is delayed.</w:t>
+        <w:rPr>
+          <w:b/>
+        </w:rPr>
+        <w:t xml:space="preserve">Support </w:t>
+      </w:r>
+      <w:r>
+        <w:t>Offer trial values 360, 720, and 900 rather than require a ratio calculation. Use a number line and the words too far or too short.</w:t>
       </w:r>
     </w:p>
     <w:p>
@@ -3864,7 +4791,7 @@
         <w:t xml:space="preserve">Optional extension </w:t>
       </w:r>
       <w:r>
-        <w:t>Add a second signal and explain why its location in the sequence matters. No speed contest.</w:t>
+        <w:t>Repeat the same command twice and report the range. Then test a different slow speed while holding wheel degrees constant. Discuss duration versus travel.</w:t>
       </w:r>
     </w:p>
     <w:p>
@@ -3875,7 +4802,7 @@
         <w:t xml:space="preserve">Troubleshooting </w:t>
       </w:r>
       <w:r>
-        <w:t>No letter: check hub connection and that the program started. SyntaxError: check the quotation marks and indentation. Wrong motion: stop and check the A/B cables and base orientation before changing code.</w:t>
+        <w:t>Distance inconsistent: reset to the same front edge and check wheel friction. Robot arcs: check that tires match and both motors connect correctly. A target miss is data, not a coding failure.</w:t>
       </w:r>
     </w:p>
     <w:p>
@@ -3886,7 +4813,7 @@
         <w:t xml:space="preserve">Word Blocks equivalent </w:t>
       </w:r>
       <w:r>
-        <w:t>New Word Blocks project: when program starts; display chosen text on hub; wait 0.5 seconds; move straight for 0.25 rotations at a mentor-tested slow speed. Set movement motors to A and B. Compare the same action order.</w:t>
+        <w:t>Set variable travel to 0.5 rotations; move straight for travel rotations; display D. Try 1 rotation, then estimate the target. Block speed is a percentage and Python velocity is degrees per second, so do not copy speed numbers between them.</w:t>
       </w:r>
     </w:p>
     <w:p>
@@ -3897,7 +4824,7 @@
         <w:t xml:space="preserve">Evidence to keep </w:t>
       </w:r>
       <w:r>
-        <w:t>Record the letter, pause value, predicted order, and observed order. Individual exit: “A program is ___, and the line I changed made ___ happen.”</w:t>
+        <w:t>Three rows: wheel degrees, prediction in cm, measured cm, error from 40 cm. Individual exit: identify the variable and defend one proposed change.</w:t>
       </w:r>
     </w:p>
     <w:p>
@@ -3908,7 +4835,7 @@
         <w:t xml:space="preserve">Expected reasoning </w:t>
       </w:r>
       <w:r>
-        <w:t>Show Y, wait, then drive. A longer pause changes waiting time, not the drive distance. A signal-only run still demonstrates sequence.</w:t>
+        <w:t>About 18 cm is a reasonable prediction for the example. The actual distance needs measurement. Increasing wheel degrees should increase travel when other conditions stay stable.</w:t>
       </w:r>
     </w:p>
     <w:p>
@@ -3920,7 +4847,7 @@
         <w:pageBreakBefore/>
       </w:pPr>
       <w:r>
-        <w:t>Week 2 Delivery to a target</w:t>
+        <w:t>Week 3 Robot dance studio</w:t>
       </w:r>
     </w:p>
     <w:p>
@@ -3931,7 +4858,7 @@
         <w:t xml:space="preserve">Mission </w:t>
       </w:r>
       <w:r>
-        <w:t>A variable controls travel</w:t>
+        <w:t>A loop repeats a routine</w:t>
       </w:r>
     </w:p>
     <w:p>
@@ -3942,12 +4869,12 @@
         <w:t xml:space="preserve">Learning objective </w:t>
       </w:r>
       <w:r>
-        <w:t>Each student changes a named distance value and uses a measurement to justify the next change.</w:t>
+        <w:t>Each student traces a counted loop and explains which actions repeat and how many times.</w:t>
       </w:r>
     </w:p>
     <w:p>
       <w:r>
-        <w:t>Minimum success The team makes three recorded trials and attempts to stop the front of the robot within 5 cm of a 40 cm target. A justified adjustment counts even if precision remains imperfect.</w:t>
+        <w:t>Minimum success A short routine repeats three times, stays within the test area, and the team accurately predicts the number of movements.</w:t>
       </w:r>
     </w:p>
     <w:p>
@@ -3958,7 +4885,7 @@
         <w:t xml:space="preserve">Materials </w:t>
       </w:r>
       <w:r>
-        <w:t>Base, measuring tape, floor-safe tape, 40 cm target measured from the same front bumper reference, test log.</w:t>
+        <w:t>Base, 100 × 100 cm clear floor area, action cards, pencil, student worksheet.</w:t>
       </w:r>
     </w:p>
     <w:p>
@@ -3969,7 +4896,7 @@
         <w:t xml:space="preserve">Before students arrive </w:t>
       </w:r>
       <w:r>
-        <w:t>Open W02_delivery.py. Set a 100 cm clear lane with a 40 cm goal and extra stopping space. Check front-edge start marks. Use 180, then 360 wheel degrees as trial values. Keep SPEED at 200.</w:t>
+        <w:t>Open W03_dance.py. Test a small pivot of 90 wheel degrees before class. Use low speed and a clear perimeter. The turn helper is an open-loop pivot, not a command for a 90-degree heading change.</w:t>
       </w:r>
     </w:p>
     <w:tbl>
@@ -4652,7 +5579,7 @@
         <w:t xml:space="preserve">Opening prompt </w:t>
       </w:r>
       <w:r>
-        <w:t>A delivery cart must reach a shelf. Is guessing enough if it has to make the trip again tomorrow?</w:t>
+        <w:t>How could we teach a robot a dance without writing the same lines over and over?</w:t>
       </w:r>
     </w:p>
     <w:p>
@@ -4663,7 +5590,7 @@
         <w:t xml:space="preserve">Demonstration </w:t>
       </w:r>
       <w:r>
-        <w:t>Show travel = 180 and explain that travel names a value. Measure the distance of one run. Change only travel. Motor degrees describe wheel rotation, not centimeters or the robot’s heading.</w:t>
+        <w:t>Compare three copies of two actions with one for loop. Say: “The indented lines belong to the loop.” Trace with a finger three times. Keep the support functions collapsed if the editor allows it.</w:t>
       </w:r>
     </w:p>
     <w:p>
@@ -4676,7 +5603,7 @@
           <w:rFonts w:ascii="Consolas" w:hAnsi="Consolas"/>
           <w:sz w:val="20"/>
         </w:rPr>
-        <w:t>travel = 180</w:t>
+        <w:t>for beat in range(3):</w:t>
       </w:r>
       <w:r>
         <w:rPr>
@@ -4684,7 +5611,15 @@
           <w:sz w:val="20"/>
         </w:rPr>
         <w:br/>
-        <w:t>await drive(travel)</w:t>
+        <w:t xml:space="preserve">    await drive(90)</w:t>
+      </w:r>
+      <w:r>
+        <w:rPr>
+          <w:rFonts w:ascii="Consolas" w:hAnsi="Consolas"/>
+          <w:sz w:val="20"/>
+        </w:rPr>
+        <w:br/>
+        <w:t xml:space="preserve">    await turn(90)</w:t>
       </w:r>
       <w:r>
         <w:rPr>
@@ -4715,7 +5650,7 @@
         <w:pageBreakBefore/>
       </w:pPr>
       <w:r>
-        <w:t>Week 2 facilitation steps</w:t>
+        <w:t>Week 3 facilitation steps</w:t>
       </w:r>
     </w:p>
     <w:p>
@@ -4726,7 +5661,7 @@
         <w:t xml:space="preserve">1. </w:t>
       </w:r>
       <w:r>
-        <w:t>Align the same front edge with the start tape every time. Run travel = 180. Measure front-edge displacement in centimeters and enter it in the log.</w:t>
+        <w:t>Walk the planned routine using paper arrows. Check that each repeat has the same actions. Write the predicted number of drives and turns.</w:t>
       </w:r>
     </w:p>
     <w:p>
@@ -4737,7 +5672,7 @@
         <w:t xml:space="preserve">2. </w:t>
       </w:r>
       <w:r>
-        <w:t>Swap driver. Predict and run travel = 360. Keep the robot, floor, starting angle, and speed the same. Compare the two measurements.</w:t>
+        <w:t>Run the supplied three-repeat routine. Navigator counts completed repeats aloud while remaining outside the lane.</w:t>
       </w:r>
     </w:p>
     <w:p>
@@ -4748,7 +5683,7 @@
         <w:t xml:space="preserve">3. </w:t>
       </w:r>
       <w:r>
-        <w:t>Estimate a value for a 40 cm delivery using the measured result. Example only: if 360 gave 18 cm, 40 / 18 × 360 is about 800. The drive helper permits up to 1080 degrees. Use your own result.</w:t>
+        <w:t>Swap roles. Change only the repeat count to 2. Predict and test. Return to 3 if the smaller routine is too brief to observe.</w:t>
       </w:r>
     </w:p>
     <w:p>
@@ -4759,17 +5694,17 @@
         <w:t xml:space="preserve">4. </w:t>
       </w:r>
       <w:r>
-        <w:t>During the final turn, test the estimate. Record signed error as measured distance minus 40. If it overshoots, reduce travel. If it stops short, increase travel.</w:t>
+        <w:t>Design a routine using two or three commands inside the loop. Use 60–120 wheel degrees per movement and 2–3 repeats. Mentor checks the predicted area before running.</w:t>
       </w:r>
     </w:p>
     <w:p>
       <w:r>
-        <w:t>5. Explain one reason two identical runs might differ, such as a crooked start or wheel slip. Park the robot and save the team’s best value.</w:t>
+        <w:t>5. Use the final turn to show the routine to the other team. Explain why a turn value of 90 does not guarantee a square corner.</w:t>
       </w:r>
     </w:p>
     <w:p>
       <w:r>
-        <w:t>Build activity  A cargo tray that keeps its load. Build a removable tray or cradle with an edge that keeps the cube aboard. Choose where the cube will sit and build a flat support. Add an edge or rail without making the tray touch the floor or wheels. Tilt the tray gently by hand and compare one change to its edge. Test: Cube stays in the tray during a gentle tilt; tray does not sag into a wheel. A mentor supplies an example tray for the first robot turn. Keep payload and tray unchanged during each distance comparison; test the team tray during the retest.</w:t>
+        <w:t>Build activity  A dancing character with moving parts. Build a lightweight character with arms or a feature that can move by hand and still stays attached. Build the character and a stable support. Add a free-moving arm, hinge or axle that stays outside the wheel path. Move it by hand ten times and improve a loose or tipping part. Test: Moving feature works by hand without jamming; support survives gentle handling. The tested character may ride on the stopped base after a mentor clearance check. Its mechanism is passive; the robot program makes the base dance.</w:t>
       </w:r>
     </w:p>
     <w:p>
@@ -4780,7 +5715,7 @@
         <w:t xml:space="preserve">Support </w:t>
       </w:r>
       <w:r>
-        <w:t>Offer trial values 360, 720, and 900 rather than require a ratio calculation. Use a number line and the words too far or too short.</w:t>
+        <w:t>Provide the complete loop and allow only the number in range to change. Trace with three counters moved one at a time.</w:t>
       </w:r>
     </w:p>
     <w:p>
@@ -4791,7 +5726,7 @@
         <w:t xml:space="preserve">Optional extension </w:t>
       </w:r>
       <w:r>
-        <w:t>Repeat the same command twice and report the range. Then test a different slow speed while holding wheel degrees constant. Discuss duration versus travel.</w:t>
+        <w:t>Define a short async dance_move function and call it twice, or calibrate a pivot for an approximate corner. Keep this optional and explain the difference between wheel and heading degrees.</w:t>
       </w:r>
     </w:p>
     <w:p>
@@ -4802,7 +5737,7 @@
         <w:t xml:space="preserve">Troubleshooting </w:t>
       </w:r>
       <w:r>
-        <w:t>Distance inconsistent: reset to the same front edge and check wheel friction. Robot arcs: check that tires match and both motors connect correctly. A target miss is data, not a coding failure.</w:t>
+        <w:t>Only one action repeats: check indentation. SyntaxError after range: check the colon. Dance drifts: reduce travel and recheck the start area; do not chase perfect geometry in this session.</w:t>
       </w:r>
     </w:p>
     <w:p>
@@ -4813,7 +5748,7 @@
         <w:t xml:space="preserve">Word Blocks equivalent </w:t>
       </w:r>
       <w:r>
-        <w:t>Set variable travel to 0.5 rotations; move straight for travel rotations; display D. Try 1 rotation, then estimate the target. Block speed is a percentage and Python velocity is degrees per second, so do not copy speed numbers between them.</w:t>
+        <w:t>When program starts; repeat 3: move straight 0.25 rotations, pivot using a mentor-tested tank or steering movement; after the repeat, display D. Match action order and repetition rather than numeric speed settings.</w:t>
       </w:r>
     </w:p>
     <w:p>
@@ -4824,7 +5759,7 @@
         <w:t xml:space="preserve">Evidence to keep </w:t>
       </w:r>
       <w:r>
-        <w:t>Three rows: wheel degrees, prediction in cm, measured cm, error from 40 cm. Individual exit: identify the variable and defend one proposed change.</w:t>
+        <w:t>Record repeats, actions inside the loop, predicted movement count, and observed count. Mark the loop body with a bracket.</w:t>
       </w:r>
     </w:p>
     <w:p>
@@ -4835,7 +5770,7 @@
         <w:t xml:space="preserve">Expected reasoning </w:t>
       </w:r>
       <w:r>
-        <w:t>About 18 cm is a reasonable prediction for the example. The actual distance needs measurement. Increasing wheel degrees should increase travel when other conditions stay stable.</w:t>
+        <w:t>Three drives and three turns. D appears once because it is outside the loop. Moving D inside makes it happen on every pass.</w:t>
       </w:r>
     </w:p>
     <w:p>
@@ -4847,7 +5782,7 @@
         <w:pageBreakBefore/>
       </w:pPr>
       <w:r>
-        <w:t>Week 3 Robot dance studio</w:t>
+        <w:t>Week 4 Parking assistant</w:t>
       </w:r>
     </w:p>
     <w:p>
@@ -4858,7 +5793,7 @@
         <w:t xml:space="preserve">Mission </w:t>
       </w:r>
       <w:r>
-        <w:t>A loop repeats a routine</w:t>
+        <w:t>A distance reading changes a decision</w:t>
       </w:r>
     </w:p>
     <w:p>
@@ -4869,12 +5804,12 @@
         <w:t xml:space="preserve">Learning objective </w:t>
       </w:r>
       <w:r>
-        <w:t>Each student traces a counted loop and explains which actions repeat and how many times.</w:t>
+        <w:t>Each student predicts a threshold decision and distinguishes a valid distance reading from an invalid reading.</w:t>
       </w:r>
     </w:p>
     <w:p>
       <w:r>
-        <w:t>Minimum success A short routine repeats three times, stays within the test area, and the team accurately predicts the number of movements.</w:t>
+        <w:t>Minimum success The robot approaches a broad cardboard wall in small steps and stops around 150 mm away. The team explains the threshold, invalid-reading stop, and movement limit.</w:t>
       </w:r>
     </w:p>
     <w:p>
@@ -4885,7 +5820,7 @@
         <w:t xml:space="preserve">Materials </w:t>
       </w:r>
       <w:r>
-        <w:t>Base, 100 × 100 cm clear floor area, action cards, pencil, student worksheet.</w:t>
+        <w:t>Distance sensor on C facing forward, rigid removable bracket, broad cardboard wall, ruler, lane at least 80 cm long.</w:t>
       </w:r>
     </w:p>
     <w:p>
@@ -4896,7 +5831,7 @@
         <w:t xml:space="preserve">Before students arrive </w:t>
       </w:r>
       <w:r>
-        <w:t>Open W03_dance.py. Test a small pivot of 90 wheel degrees before class. Use low speed and a clear perimeter. The turn helper is an open-loop pivot, not a command for a 90-degree heading change.</w:t>
+        <w:t>Mount the distance sensor before class. Open W04_parking.py. At 100, 150, and 250 mm, check readings against the ruler. Start about 300 mm from a broad, upright wall. Keep hands out of the lane.</w:t>
       </w:r>
     </w:p>
     <w:tbl>
@@ -5579,7 +6514,7 @@
         <w:t xml:space="preserve">Opening prompt </w:t>
       </w:r>
       <w:r>
-        <w:t>How could we teach a robot a dance without writing the same lines over and over?</w:t>
+        <w:t>How can a robot decide when it is close enough without someone shouting stop?</w:t>
       </w:r>
     </w:p>
     <w:p>
@@ -5590,7 +6525,7 @@
         <w:t xml:space="preserve">Demonstration </w:t>
       </w:r>
       <w:r>
-        <w:t>Compare three copies of two actions with one for loop. Say: “The indented lines belong to the loop.” Trace with a finger three times. Keep the support functions collapsed if the editor allows it.</w:t>
+        <w:t>Show a live distance reading while the robot stays still. Python readings use millimeters. Trace the condition 0 &lt;= gap &lt;= stop_mm. An invalid negative value must stop the activity for a check.</w:t>
       </w:r>
     </w:p>
     <w:p>
@@ -5603,7 +6538,7 @@
           <w:rFonts w:ascii="Consolas" w:hAnsi="Consolas"/>
           <w:sz w:val="20"/>
         </w:rPr>
-        <w:t>for beat in range(3):</w:t>
+        <w:t>stop_mm = 150</w:t>
       </w:r>
       <w:r>
         <w:rPr>
@@ -5611,7 +6546,7 @@
           <w:sz w:val="20"/>
         </w:rPr>
         <w:br/>
-        <w:t xml:space="preserve">    await drive(90)</w:t>
+        <w:t>gap = distance_sensor.distance(port.C)</w:t>
       </w:r>
       <w:r>
         <w:rPr>
@@ -5619,7 +6554,7 @@
           <w:sz w:val="20"/>
         </w:rPr>
         <w:br/>
-        <w:t xml:space="preserve">    await turn(90)</w:t>
+        <w:t>if 0 &lt;= gap &lt;= stop_mm:</w:t>
       </w:r>
       <w:r>
         <w:rPr>
@@ -5627,7 +6562,7 @@
           <w:sz w:val="20"/>
         </w:rPr>
         <w:br/>
-        <w:t>await signal("D")</w:t>
+        <w:t xml:space="preserve">    await signal("P")</w:t>
       </w:r>
     </w:p>
     <w:p>
@@ -5650,7 +6585,7 @@
         <w:pageBreakBefore/>
       </w:pPr>
       <w:r>
-        <w:t>Week 3 facilitation steps</w:t>
+        <w:t>Week 4 facilitation steps</w:t>
       </w:r>
     </w:p>
     <w:p>
@@ -5661,7 +6596,7 @@
         <w:t xml:space="preserve">1. </w:t>
       </w:r>
       <w:r>
-        <w:t>Walk the planned routine using paper arrows. Check that each repeat has the same actions. Write the predicted number of drives and turns.</w:t>
+        <w:t>With wheels still, measure the wall distance using a ruler. Compare two sensor readings with the measured gap. Explain millimeters versus centimeters.</w:t>
       </w:r>
     </w:p>
     <w:p>
@@ -5672,7 +6607,7 @@
         <w:t xml:space="preserve">2. </w:t>
       </w:r>
       <w:r>
-        <w:t>Run the supplied three-repeat routine. Navigator counts completed repeats aloud while remaining outside the lane.</w:t>
+        <w:t>Set stop_mm = 150. Start roughly 300 mm away and run. The supplied helper checks the sensor before each short 30-wheel-degree movement and limits the run to 12 steps.</w:t>
       </w:r>
     </w:p>
     <w:p>
@@ -5683,7 +6618,7 @@
         <w:t xml:space="preserve">3. </w:t>
       </w:r>
       <w:r>
-        <w:t>Swap roles. Change only the repeat count to 2. Predict and test. Return to 3 if the smaller routine is too brief to observe.</w:t>
+        <w:t>Measure the stopped distance and record the reason printed by the program: near, invalid, or limit. A limit message does not mean successful parking.</w:t>
       </w:r>
     </w:p>
     <w:p>
@@ -5694,17 +6629,23 @@
         <w:t xml:space="preserve">4. </w:t>
       </w:r>
       <w:r>
-        <w:t>Design a routine using two or three commands inside the loop. Use 60–120 wheel degrees per movement and 2–3 repeats. Mentor checks the predicted area before running.</w:t>
+        <w:t>Swap roles. Try a 200 mm threshold from the same start. Predict whether the robot will stop sooner or later. Keep the wall broad and square to the sensor.</w:t>
       </w:r>
     </w:p>
     <w:p>
       <w:r>
-        <w:t>5. Use the final turn to show the routine to the other team. Explain why a turn value of 90 does not guarantee a square corner.</w:t>
+        <w:rPr>
+          <w:b/>
+        </w:rPr>
+        <w:t xml:space="preserve">5. </w:t>
+      </w:r>
+      <w:r>
+        <w:t>On the final turn, repeat one chosen setting. Explain why this classroom prototype is not a real vehicle safety system.</w:t>
       </w:r>
     </w:p>
     <w:p>
       <w:r>
-        <w:t>Build activity  A dancing character with moving parts. Build a lightweight character with arms or a feature that can move by hand and still stays attached. Build the character and a stable support. Add a free-moving arm, hinge or axle that stays outside the wheel path. Move it by hand ten times and improve a loose or tipping part. Test: Moving feature works by hand without jamming; support survives gentle handling. The tested character may ride on the stopped base after a mentor clearance check. Its mechanism is passive; the robot program makes the base dance.</w:t>
+        <w:t>Build activity  A garage with a dependable target wall. Build a stable garage entrance and a broad, flat back wall that the distance sensor can face. Make a bay wider than the base footprint. Brace the flat back wall so a light tap does not tip it over. Move the unpowered proxy through the entrance. Mark a stopping zone in front of the wall. Test: Proxy clears the entrance; target wall stays flat and upright at sensor height. Use the mentor wall during initial parking tests. The mentor approves the team garage before its robot retest; keep the broad wall and sensor line of sight clear.</w:t>
       </w:r>
     </w:p>
     <w:p>
@@ -5715,7 +6656,7 @@
         <w:t xml:space="preserve">Support </w:t>
       </w:r>
       <w:r>
-        <w:t>Provide the complete loop and allow only the number in range to change. Trace with three counters moved one at a time.</w:t>
+        <w:t>Provide the decision rule in words and highlight the threshold number. A stationary sensor demonstration can meet the decision objective if movement fails.</w:t>
       </w:r>
     </w:p>
     <w:p>
@@ -5726,7 +6667,7 @@
         <w:t xml:space="preserve">Optional extension </w:t>
       </w:r>
       <w:r>
-        <w:t>Define a short async dance_move function and call it twice, or calibrate a pivot for an approximate corner. Keep this optional and explain the difference between wheel and heading degrees.</w:t>
+        <w:t>Change one wall property, such as angle, and compare valid readings. Explain why poor readings require a fallback. Do not remove the step limit.</w:t>
       </w:r>
     </w:p>
     <w:p>
@@ -5737,7 +6678,7 @@
         <w:t xml:space="preserve">Troubleshooting </w:t>
       </w:r>
       <w:r>
-        <w:t>Only one action repeats: check indentation. SyntaxError after range: check the colon. Dance drifts: reduce travel and recheck the start area; do not chase perfect geometry in this session.</w:t>
+        <w:t>Invalid reading: check the C port and wall angle. Reaches step limit: move start closer or inspect readings. Stops too close: slow down and inspect step size. No collision is required to test the sensor.</w:t>
       </w:r>
     </w:p>
     <w:p>
@@ -5748,7 +6689,7 @@
         <w:t xml:space="preserve">Word Blocks equivalent </w:t>
       </w:r>
       <w:r>
-        <w:t>When program starts; repeat 3: move straight 0.25 rotations, pivot using a mentor-tested tank or steering movement; after the repeat, display D. Match action order and repetition rather than numeric speed settings.</w:t>
+        <w:t>Set near false. Repeat up to 12 checks: if distance is within a valid near range, set near true; otherwise, if still allowed, move straight a small increment. Use app distance units shown on the block, commonly cm: 15 cm equals 150 mm. Mentor verifies invalid-reading behavior and uses manual stop if needed.</w:t>
       </w:r>
     </w:p>
     <w:p>
@@ -5759,7 +6700,7 @@
         <w:t xml:space="preserve">Evidence to keep </w:t>
       </w:r>
       <w:r>
-        <w:t>Record repeats, actions inside the loop, predicted movement count, and observed count. Mark the loop body with a bracket.</w:t>
+        <w:t>Log threshold, start gap, stopped gap, and stop reason for two trials. Individual exit uses a new reading of 170 mm with a 150 mm threshold.</w:t>
       </w:r>
     </w:p>
     <w:p>
@@ -5770,7 +6711,7 @@
         <w:t xml:space="preserve">Expected reasoning </w:t>
       </w:r>
       <w:r>
-        <w:t>Three drives and three turns. D appears once because it is outside the loop. Moving D inside makes it happen on every pass.</w:t>
+        <w:t>220 continues. 150 and 90 are near. -1 is invalid and must not be treated as a real near distance. At 170 with a threshold of 150, continue if a step remains.</w:t>
       </w:r>
     </w:p>
     <w:p>
@@ -5782,7 +6723,7 @@
         <w:pageBreakBefore/>
       </w:pPr>
       <w:r>
-        <w:t>Week 4 Parking assistant</w:t>
+        <w:t>Week 5 The floor tells the robot</w:t>
       </w:r>
     </w:p>
     <w:p>
@@ -5793,7 +6734,7 @@
         <w:t xml:space="preserve">Mission </w:t>
       </w:r>
       <w:r>
-        <w:t>A distance reading changes a decision</w:t>
+        <w:t>A dark marker identifies a delivery stop</w:t>
       </w:r>
     </w:p>
     <w:p>
@@ -5804,12 +6745,12 @@
         <w:t xml:space="preserve">Learning objective </w:t>
       </w:r>
       <w:r>
-        <w:t>Each student predicts a threshold decision and distinguishes a valid distance reading from an invalid reading.</w:t>
+        <w:t>Each student uses measured bright and dark readings to choose a threshold and explain a repeated sensor check.</w:t>
       </w:r>
     </w:p>
     <w:p>
       <w:r>
-        <w:t>Minimum success The robot approaches a broad cardboard wall in small steps and stops around 150 mm away. The team explains the threshold, invalid-reading stop, and movement limit.</w:t>
+        <w:t>Minimum success The robot stops on a wide dark floor marker in at least one of two trials, and the team explains its chosen threshold using observations.</w:t>
       </w:r>
     </w:p>
     <w:p>
@@ -5820,7 +6761,7 @@
         <w:t xml:space="preserve">Materials </w:t>
       </w:r>
       <w:r>
-        <w:t>Distance sensor on C facing forward, rigid removable bracket, broad cardboard wall, ruler, lane at least 80 cm long.</w:t>
+        <w:t>Color sensor on D pointing down, white paper or light mat, dark matte tape at least 5 cm wide across the lane, ruler.</w:t>
       </w:r>
     </w:p>
     <w:p>
@@ -5831,7 +6772,7 @@
         <w:t xml:space="preserve">Before students arrive </w:t>
       </w:r>
       <w:r>
-        <w:t>Mount the distance sensor before class. Open W04_parking.py. At 100, 150, and 250 mm, check readings against the ruler. Start about 300 mm from a broad, upright wall. Keep hands out of the lane.</w:t>
+        <w:t>Mount sensor roughly 1–2 cm above the surface as a starting setup, then bench-adjust until bright and dark readings clearly differ. Open W05_marker.py. Put the marker about 25 cm ahead of the sensor starting position. Retest under room lighting.</w:t>
       </w:r>
     </w:p>
     <w:tbl>
@@ -6514,7 +7455,7 @@
         <w:t xml:space="preserve">Opening prompt </w:t>
       </w:r>
       <w:r>
-        <w:t>How can a robot decide when it is close enough without someone shouting stop?</w:t>
+        <w:t>Could a strip on the floor tell a delivery robot where to stop?</w:t>
       </w:r>
     </w:p>
     <w:p>
@@ -6525,7 +7466,7 @@
         <w:t xml:space="preserve">Demonstration </w:t>
       </w:r>
       <w:r>
-        <w:t>Show a live distance reading while the robot stays still. Python readings use millimeters. Trace the condition 0 &lt;= gap &lt;= stop_mm. An invalid negative value must stop the activity for a check.</w:t>
+        <w:t>Hold the robot still over light and dark surfaces. Show reflection values, whose scale is 0–100. Choose a threshold between observed readings. This lesson detects one stop marker, not a line-following route.</w:t>
       </w:r>
     </w:p>
     <w:p>
@@ -6538,7 +7479,7 @@
           <w:rFonts w:ascii="Consolas" w:hAnsi="Consolas"/>
           <w:sz w:val="20"/>
         </w:rPr>
-        <w:t>stop_mm = 150</w:t>
+        <w:t>threshold = 40</w:t>
       </w:r>
       <w:r>
         <w:rPr>
@@ -6546,7 +7487,7 @@
           <w:sz w:val="20"/>
         </w:rPr>
         <w:br/>
-        <w:t>gap = distance_sensor.distance(port.C)</w:t>
+        <w:t>reading = color_sensor.reflection(port.D)</w:t>
       </w:r>
       <w:r>
         <w:rPr>
@@ -6554,7 +7495,7 @@
           <w:sz w:val="20"/>
         </w:rPr>
         <w:br/>
-        <w:t>if 0 &lt;= gap &lt;= stop_mm:</w:t>
+        <w:t>if reading &lt; threshold:</w:t>
       </w:r>
       <w:r>
         <w:rPr>
@@ -6562,7 +7503,7 @@
           <w:sz w:val="20"/>
         </w:rPr>
         <w:br/>
-        <w:t xml:space="preserve">    await signal("P")</w:t>
+        <w:t xml:space="preserve">    await signal("M")</w:t>
       </w:r>
     </w:p>
     <w:p>
@@ -6585,7 +7526,7 @@
         <w:pageBreakBefore/>
       </w:pPr>
       <w:r>
-        <w:t>Week 4 facilitation steps</w:t>
+        <w:t>Week 5 facilitation steps</w:t>
       </w:r>
     </w:p>
     <w:p>
@@ -6596,7 +7537,7 @@
         <w:t xml:space="preserve">1. </w:t>
       </w:r>
       <w:r>
-        <w:t>With wheels still, measure the wall distance using a ruler. Compare two sensor readings with the measured gap. Explain millimeters versus centimeters.</w:t>
+        <w:t>Read the stationary sensor over the light surface and dark marker. Record each twice. Choose a value between the two clusters of readings.</w:t>
       </w:r>
     </w:p>
     <w:p>
@@ -6607,7 +7548,7 @@
         <w:t xml:space="preserve">2. </w:t>
       </w:r>
       <w:r>
-        <w:t>Set stop_mm = 150. Start roughly 300 mm away and run. The supplied helper checks the sensor before each short 30-wheel-degree movement and limits the run to 12 steps.</w:t>
+        <w:t>Enter that value as threshold. Place the sensor behind the marker at the marked start. Run the bounded marker routine, which checks before each short movement.</w:t>
       </w:r>
     </w:p>
     <w:p>
@@ -6618,7 +7559,7 @@
         <w:t xml:space="preserve">3. </w:t>
       </w:r>
       <w:r>
-        <w:t>Measure the stopped distance and record the reason printed by the program: near, invalid, or limit. A limit message does not mean successful parking.</w:t>
+        <w:t>Observe whether the robot stops with its sensor above the tape. Record the stop reason: marker or limit. Keep a clear runout beyond the strip.</w:t>
       </w:r>
     </w:p>
     <w:p>
@@ -6629,7 +7570,7 @@
         <w:t xml:space="preserve">4. </w:t>
       </w:r>
       <w:r>
-        <w:t>Swap roles. Try a 200 mm threshold from the same start. Predict whether the robot will stop sooner or later. Keep the wall broad and square to the sensor.</w:t>
+        <w:t>Swap roles and repeat from the same start. If it misses, check sensor height, threshold, tape width, and start distance in that order. Change one thing.</w:t>
       </w:r>
     </w:p>
     <w:p>
@@ -6640,12 +7581,12 @@
         <w:t xml:space="preserve">5. </w:t>
       </w:r>
       <w:r>
-        <w:t>On the final turn, repeat one chosen setting. Explain why this classroom prototype is not a real vehicle safety system.</w:t>
+        <w:t>Use the final turn to test the revised setting and explain how a measured threshold differs from a guessed number.</w:t>
       </w:r>
     </w:p>
     <w:p>
       <w:r>
-        <w:t>Build activity  A garage with a dependable target wall. Build a stable garage entrance and a broad, flat back wall that the distance sensor can face. Make a bay wider than the base footprint. Brace the flat back wall so a light tap does not tip it over. Move the unpowered proxy through the entrance. Mark a stopping zone in front of the wall. Test: Proxy clears the entrance; target wall stays flat and upright at sensor height. Use the mentor wall during initial parking tests. The mentor approves the team garage before its robot retest; keep the broad wall and sensor line of sight clear.</w:t>
+        <w:t>Build activity  A road with a delivery marker. Build a flat road section with one clear dark stopping band and a small delivery platform beside it. Join flat tiles without raised edges in the wheel path. Add one wide dark band across the sensor path and a delivery platform off the lane. Slide the footprint template through the route and remove catches or loose tape. Test: Flat route, one visible marker and clear wheel/sensor paths. Mentor verifies the marker is wide enough for the tested movement step. Robot teams measure the actual bright/dark readings. Use those measurements to choose the threshold; a colored decoration is not automatically a reliable marker.</w:t>
       </w:r>
     </w:p>
     <w:p>
@@ -6656,7 +7597,7 @@
         <w:t xml:space="preserve">Support </w:t>
       </w:r>
       <w:r>
-        <w:t>Provide the decision rule in words and highlight the threshold number. A stationary sensor demonstration can meet the decision objective if movement fails.</w:t>
+        <w:t>Use a number line and ask students to choose any value clearly between dark and bright. Mentor pre-mounts the bracket and helps type the condition.</w:t>
       </w:r>
     </w:p>
     <w:p>
@@ -6667,7 +7608,7 @@
         <w:t xml:space="preserve">Optional extension </w:t>
       </w:r>
       <w:r>
-        <w:t>Change one wall property, such as angle, and compare valid readings. Explain why poor readings require a fallback. Do not remove the step limit.</w:t>
+        <w:t>Compare results with the room lights or surface changed. Recalibrate and explain why the old threshold may fail. An advanced student can count steps without removing the 24-step limit.</w:t>
       </w:r>
     </w:p>
     <w:p>
@@ -6678,7 +7619,7 @@
         <w:t xml:space="preserve">Troubleshooting </w:t>
       </w:r>
       <w:r>
-        <w:t>Invalid reading: check the C port and wall angle. Reaches step limit: move start closer or inspect readings. Stops too close: slow down and inspect step size. No collision is required to test the sensor.</w:t>
+        <w:t>Always stops: sensor starts on dark tape or threshold is too high. Never stops: tape lacks contrast, sensor is too high, threshold is too low, or 24 steps cannot reach the marker. Check a stationary reading first.</w:t>
       </w:r>
     </w:p>
     <w:p>
@@ -6689,7 +7630,7 @@
         <w:t xml:space="preserve">Word Blocks equivalent </w:t>
       </w:r>
       <w:r>
-        <w:t>Set near false. Repeat up to 12 checks: if distance is within a valid near range, set near true; otherwise, if still allowed, move straight a small increment. Use app distance units shown on the block, commonly cm: 15 cm equals 150 mm. Mentor verifies invalid-reading behavior and uses manual stop if needed.</w:t>
+        <w:t>Use reflected light intensity on D. Set found false. Repeat 24 times: if not found, check reading; if below threshold, set found true; else move a small increment. End with a marker or limit signal. Use the same measured threshold if the block reports the same 0–100 scale.</w:t>
       </w:r>
     </w:p>
     <w:p>
@@ -6700,7 +7641,7 @@
         <w:t xml:space="preserve">Evidence to keep </w:t>
       </w:r>
       <w:r>
-        <w:t>Log threshold, start gap, stopped gap, and stop reason for two trials. Individual exit uses a new reading of 170 mm with a 150 mm threshold.</w:t>
+        <w:t>Two bright readings, two dark readings, chosen threshold, and two run outcomes. Individual exit: explain a threshold for dark 20 and bright 70.</w:t>
       </w:r>
     </w:p>
     <w:p>
@@ -6711,7 +7652,7 @@
         <w:t xml:space="preserve">Expected reasoning </w:t>
       </w:r>
       <w:r>
-        <w:t>220 continues. 150 and 90 are near. -1 is invalid and must not be treated as a real near distance. At 170 with a threshold of 150, continue if a step remains.</w:t>
+        <w:t>44 lies between 12 and 76. A threshold below both readings never recognizes either as dark. For 20 and 70, 45 is a reasonable starting threshold, then test it.</w:t>
       </w:r>
     </w:p>
     <w:p>
@@ -6723,7 +7664,7 @@
         <w:pageBreakBefore/>
       </w:pPr>
       <w:r>
-        <w:t>Week 5 The floor tells the robot</w:t>
+        <w:t>Week 6 A rescue attachment</w:t>
       </w:r>
     </w:p>
     <w:p>
@@ -6734,7 +7675,7 @@
         <w:t xml:space="preserve">Mission </w:t>
       </w:r>
       <w:r>
-        <w:t>A dark marker identifies a delivery stop</w:t>
+        <w:t>A small mechanical change improves delivery</w:t>
       </w:r>
     </w:p>
     <w:p>
@@ -6745,12 +7686,12 @@
         <w:t xml:space="preserve">Learning objective </w:t>
       </w:r>
       <w:r>
-        <w:t>Each student uses measured bright and dark readings to choose a threshold and explain a repeated sensor check.</w:t>
+        <w:t>Each student contributes a design idea and compares two attachment trials while using an existing Python function.</w:t>
       </w:r>
     </w:p>
     <w:p>
       <w:r>
-        <w:t>Minimum success The robot stops on a wide dark floor marker in at least one of two trials, and the team explains its chosen threshold using observations.</w:t>
+        <w:t>Minimum success A removable passive plow guides one lightweight cube toward a target without blocking wheels or the sensor. The team documents one design change and explains deliver().</w:t>
       </w:r>
     </w:p>
     <w:p>
@@ -6761,18 +7702,12 @@
         <w:t xml:space="preserve">Materials </w:t>
       </w:r>
       <w:r>
-        <w:t>Color sensor on D pointing down, white paper or light mat, dark matte tape at least 5 cm wide across the lane, ruler.</w:t>
+        <w:t>Base with D sensor, spare beams and pins from the same kit, one 3–4 cm foam or paper cube, tape target, two small labeled attachment trays.</w:t>
       </w:r>
     </w:p>
     <w:p>
       <w:r>
-        <w:rPr>
-          <w:b/>
-        </w:rPr>
-        <w:t xml:space="preserve">Before students arrive </w:t>
-      </w:r>
-      <w:r>
-        <w:t>Mount sensor roughly 1–2 cm above the surface as a starting setup, then bench-adjust until bright and dark readings clearly differ. Open W05_marker.py. Put the marker about 25 cm ahead of the sensor starting position. Retest under room lighting.</w:t>
+        <w:t>Before students arrive Reserve equal spare parts for each team. Test a passive plow mount. Place the stop strip 25 cm ahead of the color sensor at the starting pose. After a dry run, mark the cube delivery zone ahead of the stopped plow. Open W06_rescue.py.</w:t>
       </w:r>
     </w:p>
     <w:tbl>
@@ -7455,7 +8390,7 @@
         <w:t xml:space="preserve">Opening prompt </w:t>
       </w:r>
       <w:r>
-        <w:t>Could a strip on the floor tell a delivery robot where to stop?</w:t>
+        <w:t>A community center needs a robot to move a dropped supply box. What shape will keep the box from escaping sideways?</w:t>
       </w:r>
     </w:p>
     <w:p>
@@ -7466,7 +8401,7 @@
         <w:t xml:space="preserve">Demonstration </w:t>
       </w:r>
       <w:r>
-        <w:t>Hold the robot still over light and dark surfaces. Show reflection values, whose scale is 0–100. Choose a threshold between observed readings. This lesson detects one stop marker, not a line-following route.</w:t>
+        <w:t>Show a flat bumper and ask what might improve it. Point to async def deliver and await deliver(). Explain that a function gives a useful group of steps a name. The provided function reuses marker detection.</w:t>
       </w:r>
     </w:p>
     <w:p>
@@ -7479,7 +8414,7 @@
           <w:rFonts w:ascii="Consolas" w:hAnsi="Consolas"/>
           <w:sz w:val="20"/>
         </w:rPr>
-        <w:t>threshold = 40</w:t>
+        <w:t>async def deliver():</w:t>
       </w:r>
       <w:r>
         <w:rPr>
@@ -7487,7 +8422,7 @@
           <w:sz w:val="20"/>
         </w:rPr>
         <w:br/>
-        <w:t>reading = color_sensor.reflection(port.D)</w:t>
+        <w:t xml:space="preserve">    await signal("R")</w:t>
       </w:r>
       <w:r>
         <w:rPr>
@@ -7495,7 +8430,7 @@
           <w:sz w:val="20"/>
         </w:rPr>
         <w:br/>
-        <w:t>if reading &lt; threshold:</w:t>
+        <w:t xml:space="preserve">    result = await seek_marker(threshold)</w:t>
       </w:r>
       <w:r>
         <w:rPr>
@@ -7503,7 +8438,30 @@
           <w:sz w:val="20"/>
         </w:rPr>
         <w:br/>
-        <w:t xml:space="preserve">    await signal("M")</w:t>
+        <w:t xml:space="preserve">    print(result)</w:t>
+      </w:r>
+      <w:r>
+        <w:rPr>
+          <w:rFonts w:ascii="Consolas" w:hAnsi="Consolas"/>
+          <w:sz w:val="20"/>
+        </w:rPr>
+        <w:br/>
+      </w:r>
+      <w:r>
+        <w:rPr>
+          <w:rFonts w:ascii="Consolas" w:hAnsi="Consolas"/>
+          <w:sz w:val="20"/>
+        </w:rPr>
+        <w:br/>
+        <w:t># inside student_recipe</w:t>
+      </w:r>
+      <w:r>
+        <w:rPr>
+          <w:rFonts w:ascii="Consolas" w:hAnsi="Consolas"/>
+          <w:sz w:val="20"/>
+        </w:rPr>
+        <w:br/>
+        <w:t>await deliver()</w:t>
       </w:r>
     </w:p>
     <w:p>
@@ -7526,7 +8484,7 @@
         <w:pageBreakBefore/>
       </w:pPr>
       <w:r>
-        <w:t>Week 5 facilitation steps</w:t>
+        <w:t>Week 6 facilitation steps</w:t>
       </w:r>
     </w:p>
     <w:p>
@@ -7537,18 +8495,12 @@
         <w:t xml:space="preserve">1. </w:t>
       </w:r>
       <w:r>
-        <w:t>Read the stationary sensor over the light surface and dark marker. Record each twice. Choose a value between the two clusters of readings.</w:t>
+        <w:t>Sketch two possible plows. Agree on one to build. Constraints: use allocated spare parts, attach to the existing chassis, no powered gripper, and keep the sensor’s view clear.</w:t>
       </w:r>
     </w:p>
     <w:p>
       <w:r>
-        <w:rPr>
-          <w:b/>
-        </w:rPr>
-        <w:t xml:space="preserve">2. </w:t>
-      </w:r>
-      <w:r>
-        <w:t>Enter that value as threshold. Place the sensor behind the marker at the marked start. Run the bounded marker routine, which checks before each short movement.</w:t>
+        <w:t>2. Build a small removable attachment while the other team tests. Mentor checks wheel clearance and lightly checks that it will not fall into the drive path.</w:t>
       </w:r>
     </w:p>
     <w:p>
@@ -7559,7 +8511,7 @@
         <w:t xml:space="preserve">3. </w:t>
       </w:r>
       <w:r>
-        <w:t>Observe whether the robot stops with its sensor above the tape. Record the stop reason: marker or limit. Keep a clear runout beyond the strip.</w:t>
+        <w:t>At the robot turn, attach the plow and place the cube just in front. Use the previously calibrated threshold. Run deliver and record whether the cube stays controlled and reaches the target area.</w:t>
       </w:r>
     </w:p>
     <w:p>
@@ -7570,23 +8522,17 @@
         <w:t xml:space="preserve">4. </w:t>
       </w:r>
       <w:r>
-        <w:t>Swap roles and repeat from the same start. If it misses, check sensor height, threshold, tape width, and start distance in that order. Change one thing.</w:t>
+        <w:t>Swap driver. Change one mechanical feature, such as guide spacing, and repeat. Keep cube, program, and start pose the same so the comparison is useful.</w:t>
       </w:r>
     </w:p>
     <w:p>
       <w:r>
-        <w:rPr>
-          <w:b/>
-        </w:rPr>
-        <w:t xml:space="preserve">5. </w:t>
-      </w:r>
-      <w:r>
-        <w:t>Use the final turn to test the revised setting and explain how a measured threshold differs from a guessed number.</w:t>
+        <w:t>5. In the final turn, test the better version. Remove and store each team’s attachment in its labeled tray. Explain the function name and one design tradeoff.</w:t>
       </w:r>
     </w:p>
     <w:p>
       <w:r>
-        <w:t>Build activity  A road with a delivery marker. Build a flat road section with one clear dark stopping band and a small delivery platform beside it. Join flat tiles without raised edges in the wheel path. Add one wide dark band across the sensor path and a delivery platform off the lane. Slide the footprint template through the route and remove catches or loose tape. Test: Flat route, one visible marker and clear wheel/sensor paths. Mentor verifies the marker is wide enough for the tested movement step. Robot teams measure the actual bright/dark readings. Use those measurements to choose the threshold; a colored decoration is not automatically a reliable marker.</w:t>
+        <w:t>Build activity  A rescue scoop or guide. Build a removable guide that pushes a cube without trapping it under the robot. Make a flat bumper and push the cube by hand with the proxy. Add short side guides or change one guiding edge. Compare the two versions with the same cube and hand-test path. Test: Cube moves ahead; guide clears the floor and does not cover the downward sensor. Each robot station has a mentor sample before the first rotation. Fit approved team guides for retests. Keep motor and sensor mounts unchanged.</w:t>
       </w:r>
     </w:p>
     <w:p>
@@ -7597,7 +8543,7 @@
         <w:t xml:space="preserve">Support </w:t>
       </w:r>
       <w:r>
-        <w:t>Use a number line and ask students to choose any value clearly between dark and bright. Mentor pre-mounts the bracket and helps type the condition.</w:t>
+        <w:t>Provide a simple flat plow starter and ask students to change guide width. A paper mockup can support the design explanation if building takes too long.</w:t>
       </w:r>
     </w:p>
     <w:p>
@@ -7608,7 +8554,7 @@
         <w:t xml:space="preserve">Optional extension </w:t>
       </w:r>
       <w:r>
-        <w:t>Compare results with the room lights or surface changed. Recalibrate and explain why the old threshold may fail. An advanced student can count steps without removing the 24-step limit.</w:t>
+        <w:t>Compare a flat bumper with side guides using three runs each if time permits. Compute successful deliveries out of attempts. Extra motors are outside the core activity.</w:t>
       </w:r>
     </w:p>
     <w:p>
@@ -7619,7 +8565,7 @@
         <w:t xml:space="preserve">Troubleshooting </w:t>
       </w:r>
       <w:r>
-        <w:t>Always stops: sensor starts on dark tape or threshold is too high. Never stops: tape lacks contrast, sensor is too high, threshold is too low, or 24 steps cannot reach the marker. Check a stationary reading first.</w:t>
+        <w:t>Cube slips: adjust side guide width. Robot stalls: lighten the attachment and remove dragging parts. Sensor misses: relocate plow pieces that block the sensor. Reset the cube consistently.</w:t>
       </w:r>
     </w:p>
     <w:p>
@@ -7630,7 +8576,7 @@
         <w:t xml:space="preserve">Word Blocks equivalent </w:t>
       </w:r>
       <w:r>
-        <w:t>Use reflected light intensity on D. Set found false. Repeat 24 times: if not found, check reading; if below threshold, set found true; else move a small increment. End with a marker or limit signal. Use the same measured threshold if the block reports the same 0–100 scale.</w:t>
+        <w:t>Create a My Block called deliver, with a start signal and the bounded marker routine from week 5. Call deliver from the start stack. If My Blocks is unfamiliar, group and label the stack, then explain the repeated task in words.</w:t>
       </w:r>
     </w:p>
     <w:p>
@@ -7641,7 +8587,7 @@
         <w:t xml:space="preserve">Evidence to keep </w:t>
       </w:r>
       <w:r>
-        <w:t>Two bright readings, two dark readings, chosen threshold, and two run outcomes. Individual exit: explain a threshold for dark 20 and bright 70.</w:t>
+        <w:t>A labeled design sketch, two trial results, and one sentence connecting a design change to the observed outcome. Score control, not speed.</w:t>
       </w:r>
     </w:p>
     <w:p>
@@ -7652,7 +8598,7 @@
         <w:t xml:space="preserve">Expected reasoning </w:t>
       </w:r>
       <w:r>
-        <w:t>44 lies between 12 and 76. A threshold below both readings never recognizes either as dark. For 20 and 70, 45 is a reasonable starting threshold, then test it.</w:t>
+        <w:t>Side guides can reduce lateral escape but may increase friction or interfere with sensing. Calling deliver starts its named sequence. The function itself must be defined before the call can execute.</w:t>
       </w:r>
     </w:p>
     <w:p>
@@ -7664,50 +8610,32 @@
         <w:pageBreakBefore/>
       </w:pPr>
       <w:r>
-        <w:t>Week 6 A rescue attachment</w:t>
+        <w:t>Week 7 Community robot mission</w:t>
       </w:r>
     </w:p>
     <w:p>
       <w:r>
-        <w:rPr>
-          <w:b/>
-        </w:rPr>
-        <w:t xml:space="preserve">Mission </w:t>
-      </w:r>
-      <w:r>
-        <w:t>A small mechanical change improves delivery</w:t>
+        <w:t>Mission Teams choose and test a complete job</w:t>
       </w:r>
     </w:p>
     <w:p>
       <w:r>
-        <w:rPr>
-          <w:b/>
-        </w:rPr>
-        <w:t xml:space="preserve">Learning objective </w:t>
-      </w:r>
-      <w:r>
-        <w:t>Each student contributes a design idea and compares two attachment trials while using an existing Python function.</w:t>
+        <w:t>Learning objective Each team breaks a community task into at least three ordered actions and tests the most uncertain part first.</w:t>
       </w:r>
     </w:p>
     <w:p>
       <w:r>
-        <w:t>Minimum success A removable passive plow guides one lightweight cube toward a target without blocking wheels or the sensor. The team documents one design change and explains deliver().</w:t>
+        <w:t>Minimum success The team has a mission plan, one saved program, one tested subsystem, and a realistic demo goal for week 8.</w:t>
       </w:r>
     </w:p>
     <w:p>
       <w:r>
-        <w:rPr>
-          <w:b/>
-        </w:rPr>
-        <w:t xml:space="preserve">Materials </w:t>
-      </w:r>
-      <w:r>
-        <w:t>Base with D sensor, spare beams and pins from the same kit, one 3–4 cm foam or paper cube, tape target, two small labeled attachment trays.</w:t>
+        <w:t>Materials Base, team attachment, paper cube, cardboard wall or dark stop marker, tape, blueprint worksheet, saved team projects.</w:t>
       </w:r>
     </w:p>
     <w:p>
       <w:r>
-        <w:t>Before students arrive Reserve equal spare parts for each team. Test a passive plow mount. Place the stop strip 25 cm ahead of the color sensor at the starting pose. After a dry run, mark the cube delivery zone ahead of the stopped plow. Open W06_rescue.py.</w:t>
+        <w:t>Before students arrive Keep the same base and ports. Offer two core routes: supply delivery to a marker or careful parking near a shelf. Open W07_mission.py. Reserve a marked 100 × 100 cm area per kit. Each team gets its own saved recipe.</w:t>
       </w:r>
     </w:p>
     <w:tbl>
@@ -8390,934 +9318,6 @@
         <w:t xml:space="preserve">Opening prompt </w:t>
       </w:r>
       <w:r>
-        <w:t>A community center needs a robot to move a dropped supply box. What shape will keep the box from escaping sideways?</w:t>
-      </w:r>
-    </w:p>
-    <w:p>
-      <w:r>
-        <w:rPr>
-          <w:b/>
-        </w:rPr>
-        <w:t xml:space="preserve">Demonstration </w:t>
-      </w:r>
-      <w:r>
-        <w:t>Show a flat bumper and ask what might improve it. Point to async def deliver and await deliver(). Explain that a function gives a useful group of steps a name. The provided function reuses marker detection.</w:t>
-      </w:r>
-    </w:p>
-    <w:p>
-      <w:pPr>
-        <w:keepLines/>
-        <w:spacing w:before="80" w:after="120"/>
-      </w:pPr>
-      <w:r>
-        <w:rPr>
-          <w:rFonts w:ascii="Consolas" w:hAnsi="Consolas"/>
-          <w:sz w:val="20"/>
-        </w:rPr>
-        <w:t>async def deliver():</w:t>
-      </w:r>
-      <w:r>
-        <w:rPr>
-          <w:rFonts w:ascii="Consolas" w:hAnsi="Consolas"/>
-          <w:sz w:val="20"/>
-        </w:rPr>
-        <w:br/>
-        <w:t xml:space="preserve">    await signal("R")</w:t>
-      </w:r>
-      <w:r>
-        <w:rPr>
-          <w:rFonts w:ascii="Consolas" w:hAnsi="Consolas"/>
-          <w:sz w:val="20"/>
-        </w:rPr>
-        <w:br/>
-        <w:t xml:space="preserve">    result = await seek_marker(threshold)</w:t>
-      </w:r>
-      <w:r>
-        <w:rPr>
-          <w:rFonts w:ascii="Consolas" w:hAnsi="Consolas"/>
-          <w:sz w:val="20"/>
-        </w:rPr>
-        <w:br/>
-        <w:t xml:space="preserve">    print(result)</w:t>
-      </w:r>
-      <w:r>
-        <w:rPr>
-          <w:rFonts w:ascii="Consolas" w:hAnsi="Consolas"/>
-          <w:sz w:val="20"/>
-        </w:rPr>
-        <w:br/>
-      </w:r>
-      <w:r>
-        <w:rPr>
-          <w:rFonts w:ascii="Consolas" w:hAnsi="Consolas"/>
-          <w:sz w:val="20"/>
-        </w:rPr>
-        <w:br/>
-        <w:t># inside student_recipe</w:t>
-      </w:r>
-      <w:r>
-        <w:rPr>
-          <w:rFonts w:ascii="Consolas" w:hAnsi="Consolas"/>
-          <w:sz w:val="20"/>
-        </w:rPr>
-        <w:br/>
-        <w:t>await deliver()</w:t>
-      </w:r>
-    </w:p>
-    <w:p>
-      <w:r>
-        <w:rPr>
-          <w:b/>
-        </w:rPr>
-        <w:t xml:space="preserve">Code note </w:t>
-      </w:r>
-      <w:r>
-        <w:t>The code above is a discussion fragment. Run the complete supplied week file. Hardware setup and support functions are already included.</w:t>
-      </w:r>
-    </w:p>
-    <w:p>
-      <w:r/>
-    </w:p>
-    <w:p>
-      <w:pPr>
-        <w:pStyle w:val="Heading1"/>
-        <w:pageBreakBefore/>
-      </w:pPr>
-      <w:r>
-        <w:t>Week 6 facilitation steps</w:t>
-      </w:r>
-    </w:p>
-    <w:p>
-      <w:r>
-        <w:rPr>
-          <w:b/>
-        </w:rPr>
-        <w:t xml:space="preserve">1. </w:t>
-      </w:r>
-      <w:r>
-        <w:t>Sketch two possible plows. Agree on one to build. Constraints: use allocated spare parts, attach to the existing chassis, no powered gripper, and keep the sensor’s view clear.</w:t>
-      </w:r>
-    </w:p>
-    <w:p>
-      <w:r>
-        <w:t>2. Build a small removable attachment while the other team tests. Mentor checks wheel clearance and lightly checks that it will not fall into the drive path.</w:t>
-      </w:r>
-    </w:p>
-    <w:p>
-      <w:r>
-        <w:rPr>
-          <w:b/>
-        </w:rPr>
-        <w:t xml:space="preserve">3. </w:t>
-      </w:r>
-      <w:r>
-        <w:t>At the robot turn, attach the plow and place the cube just in front. Use the previously calibrated threshold. Run deliver and record whether the cube stays controlled and reaches the target area.</w:t>
-      </w:r>
-    </w:p>
-    <w:p>
-      <w:r>
-        <w:rPr>
-          <w:b/>
-        </w:rPr>
-        <w:t xml:space="preserve">4. </w:t>
-      </w:r>
-      <w:r>
-        <w:t>Swap driver. Change one mechanical feature, such as guide spacing, and repeat. Keep cube, program, and start pose the same so the comparison is useful.</w:t>
-      </w:r>
-    </w:p>
-    <w:p>
-      <w:r>
-        <w:t>5. In the final turn, test the better version. Remove and store each team’s attachment in its labeled tray. Explain the function name and one design tradeoff.</w:t>
-      </w:r>
-    </w:p>
-    <w:p>
-      <w:r>
-        <w:t>Build activity  A rescue scoop or guide. Build a removable guide that pushes a cube without trapping it under the robot. Make a flat bumper and push the cube by hand with the proxy. Add short side guides or change one guiding edge. Compare the two versions with the same cube and hand-test path. Test: Cube moves ahead; guide clears the floor and does not cover the downward sensor. Each robot station has a mentor sample before the first rotation. Fit approved team guides for retests. Keep motor and sensor mounts unchanged.</w:t>
-      </w:r>
-    </w:p>
-    <w:p>
-      <w:r>
-        <w:rPr>
-          <w:b/>
-        </w:rPr>
-        <w:t xml:space="preserve">Support </w:t>
-      </w:r>
-      <w:r>
-        <w:t>Provide a simple flat plow starter and ask students to change guide width. A paper mockup can support the design explanation if building takes too long.</w:t>
-      </w:r>
-    </w:p>
-    <w:p>
-      <w:r>
-        <w:rPr>
-          <w:b/>
-        </w:rPr>
-        <w:t xml:space="preserve">Optional extension </w:t>
-      </w:r>
-      <w:r>
-        <w:t>Compare a flat bumper with side guides using three runs each if time permits. Compute successful deliveries out of attempts. Extra motors are outside the core activity.</w:t>
-      </w:r>
-    </w:p>
-    <w:p>
-      <w:r>
-        <w:rPr>
-          <w:b/>
-        </w:rPr>
-        <w:t xml:space="preserve">Troubleshooting </w:t>
-      </w:r>
-      <w:r>
-        <w:t>Cube slips: adjust side guide width. Robot stalls: lighten the attachment and remove dragging parts. Sensor misses: relocate plow pieces that block the sensor. Reset the cube consistently.</w:t>
-      </w:r>
-    </w:p>
-    <w:p>
-      <w:r>
-        <w:rPr>
-          <w:b/>
-        </w:rPr>
-        <w:t xml:space="preserve">Word Blocks equivalent </w:t>
-      </w:r>
-      <w:r>
-        <w:t>Create a My Block called deliver, with a start signal and the bounded marker routine from week 5. Call deliver from the start stack. If My Blocks is unfamiliar, group and label the stack, then explain the repeated task in words.</w:t>
-      </w:r>
-    </w:p>
-    <w:p>
-      <w:r>
-        <w:rPr>
-          <w:b/>
-        </w:rPr>
-        <w:t xml:space="preserve">Evidence to keep </w:t>
-      </w:r>
-      <w:r>
-        <w:t>A labeled design sketch, two trial results, and one sentence connecting a design change to the observed outcome. Score control, not speed.</w:t>
-      </w:r>
-    </w:p>
-    <w:p>
-      <w:r>
-        <w:rPr>
-          <w:b/>
-        </w:rPr>
-        <w:t xml:space="preserve">Expected reasoning </w:t>
-      </w:r>
-      <w:r>
-        <w:t>Side guides can reduce lateral escape but may increase friction or interfere with sensing. Calling deliver starts its named sequence. The function itself must be defined before the call can execute.</w:t>
-      </w:r>
-    </w:p>
-    <w:p>
-      <w:r/>
-    </w:p>
-    <w:p>
-      <w:pPr>
-        <w:pStyle w:val="Heading1"/>
-        <w:pageBreakBefore/>
-      </w:pPr>
-      <w:r>
-        <w:t>Week 7 Community robot mission</w:t>
-      </w:r>
-    </w:p>
-    <w:p>
-      <w:r>
-        <w:t>Mission Teams choose and test a complete job</w:t>
-      </w:r>
-    </w:p>
-    <w:p>
-      <w:r>
-        <w:t>Learning objective Each team breaks a community task into at least three ordered actions and tests the most uncertain part first.</w:t>
-      </w:r>
-    </w:p>
-    <w:p>
-      <w:r>
-        <w:t>Minimum success The team has a mission plan, one saved program, one tested subsystem, and a realistic demo goal for week 8.</w:t>
-      </w:r>
-    </w:p>
-    <w:p>
-      <w:r>
-        <w:t>Materials Base, team attachment, paper cube, cardboard wall or dark stop marker, tape, blueprint worksheet, saved team projects.</w:t>
-      </w:r>
-    </w:p>
-    <w:p>
-      <w:r>
-        <w:t>Before students arrive Keep the same base and ports. Offer two core routes: supply delivery to a marker or careful parking near a shelf. Open W07_mission.py. Reserve a marked 100 × 100 cm area per kit. Each team gets its own saved recipe.</w:t>
-      </w:r>
-    </w:p>
-    <w:tbl>
-      <w:tblPr>
-        <w:tblW w:type="auto" w:w="0"/>
-        <w:jc w:val="center"/>
-        <w:tblLayout w:type="fixed"/>
-        <w:tblLook w:firstColumn="1" w:firstRow="1" w:lastColumn="0" w:lastRow="0" w:noHBand="0" w:noVBand="1" w:val="04A0"/>
-      </w:tblPr>
-      <w:tblGrid>
-        <w:gridCol w:w="1152"/>
-        <w:gridCol w:w="9029"/>
-      </w:tblGrid>
-      <w:tr>
-        <w:trPr>
-          <w:cantSplit/>
-          <w:tblHeader/>
-        </w:trPr>
-        <w:tc>
-          <w:tcPr>
-            <w:tcW w:type="dxa" w:w="1152"/>
-            <w:vAlign w:val="center"/>
-            <w:tcBorders>
-              <w:top w:val="single" w:sz="4" w:color="D9D9D9"/>
-              <w:left w:val="single" w:sz="4" w:color="D9D9D9"/>
-              <w:bottom w:val="single" w:sz="4" w:color="D9D9D9"/>
-              <w:right w:val="single" w:sz="4" w:color="D9D9D9"/>
-            </w:tcBorders>
-            <w:shd w:fill="243E50"/>
-            <w:tcMar>
-              <w:top w:w="65" w:type="dxa"/>
-              <w:bottom w:w="65" w:type="dxa"/>
-              <w:left w:w="90" w:type="dxa"/>
-              <w:right w:w="90" w:type="dxa"/>
-            </w:tcMar>
-          </w:tcPr>
-          <w:p>
-            <w:pPr>
-              <w:spacing w:after="20" w:line="240" w:lineRule="auto"/>
-            </w:pPr>
-            <w:r>
-              <w:rPr>
-                <w:b/>
-                <w:color w:val="FFFFFF"/>
-                <w:sz w:val="18"/>
-              </w:rPr>
-              <w:t>Time</w:t>
-            </w:r>
-          </w:p>
-        </w:tc>
-        <w:tc>
-          <w:tcPr>
-            <w:tcW w:type="dxa" w:w="9029"/>
-            <w:vAlign w:val="center"/>
-            <w:tcBorders>
-              <w:top w:val="single" w:sz="4" w:color="D9D9D9"/>
-              <w:left w:val="single" w:sz="4" w:color="D9D9D9"/>
-              <w:bottom w:val="single" w:sz="4" w:color="D9D9D9"/>
-              <w:right w:val="single" w:sz="4" w:color="D9D9D9"/>
-            </w:tcBorders>
-            <w:shd w:fill="243E50"/>
-            <w:tcMar>
-              <w:top w:w="65" w:type="dxa"/>
-              <w:bottom w:w="65" w:type="dxa"/>
-              <w:left w:w="90" w:type="dxa"/>
-              <w:right w:w="90" w:type="dxa"/>
-            </w:tcMar>
-          </w:tcPr>
-          <w:p>
-            <w:pPr>
-              <w:spacing w:after="20" w:line="240" w:lineRule="auto"/>
-            </w:pPr>
-            <w:r>
-              <w:rPr>
-                <w:b/>
-                <w:color w:val="FFFFFF"/>
-                <w:sz w:val="18"/>
-              </w:rPr>
-              <w:t>Activity</w:t>
-            </w:r>
-          </w:p>
-        </w:tc>
-      </w:tr>
-      <w:tr>
-        <w:trPr>
-          <w:cantSplit/>
-        </w:trPr>
-        <w:tc>
-          <w:tcPr>
-            <w:tcW w:type="dxa" w:w="1152"/>
-            <w:tcBorders>
-              <w:top w:val="single" w:sz="4" w:color="D9D9D9"/>
-              <w:left w:val="single" w:sz="4" w:color="D9D9D9"/>
-              <w:bottom w:val="single" w:sz="4" w:color="D9D9D9"/>
-              <w:right w:val="single" w:sz="4" w:color="D9D9D9"/>
-            </w:tcBorders>
-            <w:shd w:fill="FFFFFF"/>
-            <w:tcMar>
-              <w:top w:w="65" w:type="dxa"/>
-              <w:bottom w:w="65" w:type="dxa"/>
-              <w:left w:w="90" w:type="dxa"/>
-              <w:right w:w="90" w:type="dxa"/>
-            </w:tcMar>
-          </w:tcPr>
-          <w:p>
-            <w:pPr>
-              <w:spacing w:after="20" w:line="240" w:lineRule="auto"/>
-            </w:pPr>
-            <w:r>
-              <w:rPr>
-                <w:color w:val="000000"/>
-                <w:sz w:val="18"/>
-              </w:rPr>
-              <w:t>0–5</w:t>
-            </w:r>
-          </w:p>
-        </w:tc>
-        <w:tc>
-          <w:tcPr>
-            <w:tcW w:type="dxa" w:w="9029"/>
-            <w:tcBorders>
-              <w:top w:val="single" w:sz="4" w:color="D9D9D9"/>
-              <w:left w:val="single" w:sz="4" w:color="D9D9D9"/>
-              <w:bottom w:val="single" w:sz="4" w:color="D9D9D9"/>
-              <w:right w:val="single" w:sz="4" w:color="D9D9D9"/>
-            </w:tcBorders>
-            <w:shd w:fill="FFFFFF"/>
-            <w:tcMar>
-              <w:top w:w="65" w:type="dxa"/>
-              <w:bottom w:w="65" w:type="dxa"/>
-              <w:left w:w="90" w:type="dxa"/>
-              <w:right w:w="90" w:type="dxa"/>
-            </w:tcMar>
-          </w:tcPr>
-          <w:p>
-            <w:pPr>
-              <w:spacing w:after="20" w:line="240" w:lineRule="auto"/>
-            </w:pPr>
-            <w:r>
-              <w:rPr>
-                <w:color w:val="000000"/>
-                <w:sz w:val="18"/>
-              </w:rPr>
-              <w:t>Welcome and quick check</w:t>
-            </w:r>
-          </w:p>
-        </w:tc>
-      </w:tr>
-      <w:tr>
-        <w:trPr>
-          <w:cantSplit/>
-        </w:trPr>
-        <w:tc>
-          <w:tcPr>
-            <w:tcW w:type="dxa" w:w="1152"/>
-            <w:tcBorders>
-              <w:top w:val="single" w:sz="4" w:color="D9D9D9"/>
-              <w:left w:val="single" w:sz="4" w:color="D9D9D9"/>
-              <w:bottom w:val="single" w:sz="4" w:color="D9D9D9"/>
-              <w:right w:val="single" w:sz="4" w:color="D9D9D9"/>
-            </w:tcBorders>
-            <w:shd w:fill="F2F5F6"/>
-            <w:tcMar>
-              <w:top w:w="65" w:type="dxa"/>
-              <w:bottom w:w="65" w:type="dxa"/>
-              <w:left w:w="90" w:type="dxa"/>
-              <w:right w:w="90" w:type="dxa"/>
-            </w:tcMar>
-          </w:tcPr>
-          <w:p>
-            <w:pPr>
-              <w:spacing w:after="20" w:line="240" w:lineRule="auto"/>
-            </w:pPr>
-            <w:r>
-              <w:rPr>
-                <w:color w:val="000000"/>
-                <w:sz w:val="18"/>
-              </w:rPr>
-              <w:t>5–10</w:t>
-            </w:r>
-          </w:p>
-        </w:tc>
-        <w:tc>
-          <w:tcPr>
-            <w:tcW w:type="dxa" w:w="9029"/>
-            <w:tcBorders>
-              <w:top w:val="single" w:sz="4" w:color="D9D9D9"/>
-              <w:left w:val="single" w:sz="4" w:color="D9D9D9"/>
-              <w:bottom w:val="single" w:sz="4" w:color="D9D9D9"/>
-              <w:right w:val="single" w:sz="4" w:color="D9D9D9"/>
-            </w:tcBorders>
-            <w:shd w:fill="F2F5F6"/>
-            <w:tcMar>
-              <w:top w:w="65" w:type="dxa"/>
-              <w:bottom w:w="65" w:type="dxa"/>
-              <w:left w:w="90" w:type="dxa"/>
-              <w:right w:w="90" w:type="dxa"/>
-            </w:tcMar>
-          </w:tcPr>
-          <w:p>
-            <w:pPr>
-              <w:spacing w:after="20" w:line="240" w:lineRule="auto"/>
-            </w:pPr>
-            <w:r>
-              <w:rPr>
-                <w:color w:val="000000"/>
-                <w:sz w:val="18"/>
-              </w:rPr>
-              <w:t>Robot demonstration</w:t>
-            </w:r>
-          </w:p>
-        </w:tc>
-      </w:tr>
-      <w:tr>
-        <w:trPr>
-          <w:cantSplit/>
-        </w:trPr>
-        <w:tc>
-          <w:tcPr>
-            <w:tcW w:type="dxa" w:w="1152"/>
-            <w:tcBorders>
-              <w:top w:val="single" w:sz="4" w:color="D9D9D9"/>
-              <w:left w:val="single" w:sz="4" w:color="D9D9D9"/>
-              <w:bottom w:val="single" w:sz="4" w:color="D9D9D9"/>
-              <w:right w:val="single" w:sz="4" w:color="D9D9D9"/>
-            </w:tcBorders>
-            <w:shd w:fill="FFFFFF"/>
-            <w:tcMar>
-              <w:top w:w="65" w:type="dxa"/>
-              <w:bottom w:w="65" w:type="dxa"/>
-              <w:left w:w="90" w:type="dxa"/>
-              <w:right w:w="90" w:type="dxa"/>
-            </w:tcMar>
-          </w:tcPr>
-          <w:p>
-            <w:pPr>
-              <w:spacing w:after="20" w:line="240" w:lineRule="auto"/>
-            </w:pPr>
-            <w:r>
-              <w:rPr>
-                <w:color w:val="000000"/>
-                <w:sz w:val="18"/>
-              </w:rPr>
-              <w:t>10–14</w:t>
-            </w:r>
-          </w:p>
-        </w:tc>
-        <w:tc>
-          <w:tcPr>
-            <w:tcW w:type="dxa" w:w="9029"/>
-            <w:tcBorders>
-              <w:top w:val="single" w:sz="4" w:color="D9D9D9"/>
-              <w:left w:val="single" w:sz="4" w:color="D9D9D9"/>
-              <w:bottom w:val="single" w:sz="4" w:color="D9D9D9"/>
-              <w:right w:val="single" w:sz="4" w:color="D9D9D9"/>
-            </w:tcBorders>
-            <w:shd w:fill="FFFFFF"/>
-            <w:tcMar>
-              <w:top w:w="65" w:type="dxa"/>
-              <w:bottom w:w="65" w:type="dxa"/>
-              <w:left w:w="90" w:type="dxa"/>
-              <w:right w:w="90" w:type="dxa"/>
-            </w:tcMar>
-          </w:tcPr>
-          <w:p>
-            <w:pPr>
-              <w:spacing w:after="20" w:line="240" w:lineRule="auto"/>
-            </w:pPr>
-            <w:r>
-              <w:rPr>
-                <w:color w:val="000000"/>
-                <w:sz w:val="18"/>
-              </w:rPr>
-              <w:t>Code and prediction</w:t>
-            </w:r>
-          </w:p>
-        </w:tc>
-      </w:tr>
-      <w:tr>
-        <w:trPr>
-          <w:cantSplit/>
-        </w:trPr>
-        <w:tc>
-          <w:tcPr>
-            <w:tcW w:type="dxa" w:w="1152"/>
-            <w:tcBorders>
-              <w:top w:val="single" w:sz="4" w:color="D9D9D9"/>
-              <w:left w:val="single" w:sz="4" w:color="D9D9D9"/>
-              <w:bottom w:val="single" w:sz="4" w:color="D9D9D9"/>
-              <w:right w:val="single" w:sz="4" w:color="D9D9D9"/>
-            </w:tcBorders>
-            <w:shd w:fill="F2F5F6"/>
-            <w:tcMar>
-              <w:top w:w="65" w:type="dxa"/>
-              <w:bottom w:w="65" w:type="dxa"/>
-              <w:left w:w="90" w:type="dxa"/>
-              <w:right w:w="90" w:type="dxa"/>
-            </w:tcMar>
-          </w:tcPr>
-          <w:p>
-            <w:pPr>
-              <w:spacing w:after="20" w:line="240" w:lineRule="auto"/>
-            </w:pPr>
-            <w:r>
-              <w:rPr>
-                <w:color w:val="000000"/>
-                <w:sz w:val="18"/>
-              </w:rPr>
-              <w:t>14–26</w:t>
-            </w:r>
-          </w:p>
-        </w:tc>
-        <w:tc>
-          <w:tcPr>
-            <w:tcW w:type="dxa" w:w="9029"/>
-            <w:tcBorders>
-              <w:top w:val="single" w:sz="4" w:color="D9D9D9"/>
-              <w:left w:val="single" w:sz="4" w:color="D9D9D9"/>
-              <w:bottom w:val="single" w:sz="4" w:color="D9D9D9"/>
-              <w:right w:val="single" w:sz="4" w:color="D9D9D9"/>
-            </w:tcBorders>
-            <w:shd w:fill="F2F5F6"/>
-            <w:tcMar>
-              <w:top w:w="65" w:type="dxa"/>
-              <w:bottom w:w="65" w:type="dxa"/>
-              <w:left w:w="90" w:type="dxa"/>
-              <w:right w:w="90" w:type="dxa"/>
-            </w:tcMar>
-          </w:tcPr>
-          <w:p>
-            <w:pPr>
-              <w:spacing w:after="20" w:line="240" w:lineRule="auto"/>
-            </w:pPr>
-            <w:r>
-              <w:rPr>
-                <w:color w:val="000000"/>
-                <w:sz w:val="18"/>
-              </w:rPr>
-              <w:t>First rotation</w:t>
-            </w:r>
-          </w:p>
-        </w:tc>
-      </w:tr>
-      <w:tr>
-        <w:trPr>
-          <w:cantSplit/>
-        </w:trPr>
-        <w:tc>
-          <w:tcPr>
-            <w:tcW w:type="dxa" w:w="1152"/>
-            <w:tcBorders>
-              <w:top w:val="single" w:sz="4" w:color="D9D9D9"/>
-              <w:left w:val="single" w:sz="4" w:color="D9D9D9"/>
-              <w:bottom w:val="single" w:sz="4" w:color="D9D9D9"/>
-              <w:right w:val="single" w:sz="4" w:color="D9D9D9"/>
-            </w:tcBorders>
-            <w:shd w:fill="FFFFFF"/>
-            <w:tcMar>
-              <w:top w:w="65" w:type="dxa"/>
-              <w:bottom w:w="65" w:type="dxa"/>
-              <w:left w:w="90" w:type="dxa"/>
-              <w:right w:w="90" w:type="dxa"/>
-            </w:tcMar>
-          </w:tcPr>
-          <w:p>
-            <w:pPr>
-              <w:spacing w:after="20" w:line="240" w:lineRule="auto"/>
-            </w:pPr>
-            <w:r>
-              <w:rPr>
-                <w:color w:val="000000"/>
-                <w:sz w:val="18"/>
-              </w:rPr>
-              <w:t>26–38</w:t>
-            </w:r>
-          </w:p>
-        </w:tc>
-        <w:tc>
-          <w:tcPr>
-            <w:tcW w:type="dxa" w:w="9029"/>
-            <w:tcBorders>
-              <w:top w:val="single" w:sz="4" w:color="D9D9D9"/>
-              <w:left w:val="single" w:sz="4" w:color="D9D9D9"/>
-              <w:bottom w:val="single" w:sz="4" w:color="D9D9D9"/>
-              <w:right w:val="single" w:sz="4" w:color="D9D9D9"/>
-            </w:tcBorders>
-            <w:shd w:fill="FFFFFF"/>
-            <w:tcMar>
-              <w:top w:w="65" w:type="dxa"/>
-              <w:bottom w:w="65" w:type="dxa"/>
-              <w:left w:w="90" w:type="dxa"/>
-              <w:right w:w="90" w:type="dxa"/>
-            </w:tcMar>
-          </w:tcPr>
-          <w:p>
-            <w:pPr>
-              <w:spacing w:after="20" w:line="240" w:lineRule="auto"/>
-            </w:pPr>
-            <w:r>
-              <w:rPr>
-                <w:color w:val="000000"/>
-                <w:sz w:val="18"/>
-              </w:rPr>
-              <w:t>Second rotation</w:t>
-            </w:r>
-          </w:p>
-        </w:tc>
-      </w:tr>
-      <w:tr>
-        <w:trPr>
-          <w:cantSplit/>
-        </w:trPr>
-        <w:tc>
-          <w:tcPr>
-            <w:tcW w:type="dxa" w:w="1152"/>
-            <w:tcBorders>
-              <w:top w:val="single" w:sz="4" w:color="D9D9D9"/>
-              <w:left w:val="single" w:sz="4" w:color="D9D9D9"/>
-              <w:bottom w:val="single" w:sz="4" w:color="D9D9D9"/>
-              <w:right w:val="single" w:sz="4" w:color="D9D9D9"/>
-            </w:tcBorders>
-            <w:shd w:fill="F2F5F6"/>
-            <w:tcMar>
-              <w:top w:w="65" w:type="dxa"/>
-              <w:bottom w:w="65" w:type="dxa"/>
-              <w:left w:w="90" w:type="dxa"/>
-              <w:right w:w="90" w:type="dxa"/>
-            </w:tcMar>
-          </w:tcPr>
-          <w:p>
-            <w:pPr>
-              <w:spacing w:after="20" w:line="240" w:lineRule="auto"/>
-            </w:pPr>
-            <w:r>
-              <w:rPr>
-                <w:color w:val="000000"/>
-                <w:sz w:val="18"/>
-              </w:rPr>
-              <w:t>38–44</w:t>
-            </w:r>
-          </w:p>
-        </w:tc>
-        <w:tc>
-          <w:tcPr>
-            <w:tcW w:type="dxa" w:w="9029"/>
-            <w:tcBorders>
-              <w:top w:val="single" w:sz="4" w:color="D9D9D9"/>
-              <w:left w:val="single" w:sz="4" w:color="D9D9D9"/>
-              <w:bottom w:val="single" w:sz="4" w:color="D9D9D9"/>
-              <w:right w:val="single" w:sz="4" w:color="D9D9D9"/>
-            </w:tcBorders>
-            <w:shd w:fill="F2F5F6"/>
-            <w:tcMar>
-              <w:top w:w="65" w:type="dxa"/>
-              <w:bottom w:w="65" w:type="dxa"/>
-              <w:left w:w="90" w:type="dxa"/>
-              <w:right w:w="90" w:type="dxa"/>
-            </w:tcMar>
-          </w:tcPr>
-          <w:p>
-            <w:pPr>
-              <w:spacing w:after="20" w:line="240" w:lineRule="auto"/>
-            </w:pPr>
-            <w:r>
-              <w:rPr>
-                <w:color w:val="000000"/>
-                <w:sz w:val="18"/>
-              </w:rPr>
-              <w:t>First retest</w:t>
-            </w:r>
-          </w:p>
-        </w:tc>
-      </w:tr>
-      <w:tr>
-        <w:trPr>
-          <w:cantSplit/>
-        </w:trPr>
-        <w:tc>
-          <w:tcPr>
-            <w:tcW w:type="dxa" w:w="1152"/>
-            <w:tcBorders>
-              <w:top w:val="single" w:sz="4" w:color="D9D9D9"/>
-              <w:left w:val="single" w:sz="4" w:color="D9D9D9"/>
-              <w:bottom w:val="single" w:sz="4" w:color="D9D9D9"/>
-              <w:right w:val="single" w:sz="4" w:color="D9D9D9"/>
-            </w:tcBorders>
-            <w:shd w:fill="FFFFFF"/>
-            <w:tcMar>
-              <w:top w:w="65" w:type="dxa"/>
-              <w:bottom w:w="65" w:type="dxa"/>
-              <w:left w:w="90" w:type="dxa"/>
-              <w:right w:w="90" w:type="dxa"/>
-            </w:tcMar>
-          </w:tcPr>
-          <w:p>
-            <w:pPr>
-              <w:spacing w:after="20" w:line="240" w:lineRule="auto"/>
-            </w:pPr>
-            <w:r>
-              <w:rPr>
-                <w:color w:val="000000"/>
-                <w:sz w:val="18"/>
-              </w:rPr>
-              <w:t>44–50</w:t>
-            </w:r>
-          </w:p>
-        </w:tc>
-        <w:tc>
-          <w:tcPr>
-            <w:tcW w:type="dxa" w:w="9029"/>
-            <w:tcBorders>
-              <w:top w:val="single" w:sz="4" w:color="D9D9D9"/>
-              <w:left w:val="single" w:sz="4" w:color="D9D9D9"/>
-              <w:bottom w:val="single" w:sz="4" w:color="D9D9D9"/>
-              <w:right w:val="single" w:sz="4" w:color="D9D9D9"/>
-            </w:tcBorders>
-            <w:shd w:fill="FFFFFF"/>
-            <w:tcMar>
-              <w:top w:w="65" w:type="dxa"/>
-              <w:bottom w:w="65" w:type="dxa"/>
-              <w:left w:w="90" w:type="dxa"/>
-              <w:right w:w="90" w:type="dxa"/>
-            </w:tcMar>
-          </w:tcPr>
-          <w:p>
-            <w:pPr>
-              <w:spacing w:after="20" w:line="240" w:lineRule="auto"/>
-            </w:pPr>
-            <w:r>
-              <w:rPr>
-                <w:color w:val="000000"/>
-                <w:sz w:val="18"/>
-              </w:rPr>
-              <w:t>Second retest</w:t>
-            </w:r>
-          </w:p>
-        </w:tc>
-      </w:tr>
-      <w:tr>
-        <w:trPr>
-          <w:cantSplit/>
-        </w:trPr>
-        <w:tc>
-          <w:tcPr>
-            <w:tcW w:type="dxa" w:w="1152"/>
-            <w:tcBorders>
-              <w:top w:val="single" w:sz="4" w:color="D9D9D9"/>
-              <w:left w:val="single" w:sz="4" w:color="D9D9D9"/>
-              <w:bottom w:val="single" w:sz="4" w:color="D9D9D9"/>
-              <w:right w:val="single" w:sz="4" w:color="D9D9D9"/>
-            </w:tcBorders>
-            <w:shd w:fill="F2F5F6"/>
-            <w:tcMar>
-              <w:top w:w="65" w:type="dxa"/>
-              <w:bottom w:w="65" w:type="dxa"/>
-              <w:left w:w="90" w:type="dxa"/>
-              <w:right w:w="90" w:type="dxa"/>
-            </w:tcMar>
-          </w:tcPr>
-          <w:p>
-            <w:pPr>
-              <w:spacing w:after="20" w:line="240" w:lineRule="auto"/>
-            </w:pPr>
-            <w:r>
-              <w:rPr>
-                <w:color w:val="000000"/>
-                <w:sz w:val="18"/>
-              </w:rPr>
-              <w:t>50–54</w:t>
-            </w:r>
-          </w:p>
-        </w:tc>
-        <w:tc>
-          <w:tcPr>
-            <w:tcW w:type="dxa" w:w="9029"/>
-            <w:tcBorders>
-              <w:top w:val="single" w:sz="4" w:color="D9D9D9"/>
-              <w:left w:val="single" w:sz="4" w:color="D9D9D9"/>
-              <w:bottom w:val="single" w:sz="4" w:color="D9D9D9"/>
-              <w:right w:val="single" w:sz="4" w:color="D9D9D9"/>
-            </w:tcBorders>
-            <w:shd w:fill="F2F5F6"/>
-            <w:tcMar>
-              <w:top w:w="65" w:type="dxa"/>
-              <w:bottom w:w="65" w:type="dxa"/>
-              <w:left w:w="90" w:type="dxa"/>
-              <w:right w:w="90" w:type="dxa"/>
-            </w:tcMar>
-          </w:tcPr>
-          <w:p>
-            <w:pPr>
-              <w:spacing w:after="20" w:line="240" w:lineRule="auto"/>
-            </w:pPr>
-            <w:r>
-              <w:rPr>
-                <w:color w:val="000000"/>
-                <w:sz w:val="18"/>
-              </w:rPr>
-              <w:t>Learning and observations</w:t>
-            </w:r>
-          </w:p>
-        </w:tc>
-      </w:tr>
-      <w:tr>
-        <w:trPr>
-          <w:cantSplit/>
-        </w:trPr>
-        <w:tc>
-          <w:tcPr>
-            <w:tcW w:type="dxa" w:w="1152"/>
-            <w:tcBorders>
-              <w:top w:val="single" w:sz="4" w:color="D9D9D9"/>
-              <w:left w:val="single" w:sz="4" w:color="D9D9D9"/>
-              <w:bottom w:val="single" w:sz="4" w:color="D9D9D9"/>
-              <w:right w:val="single" w:sz="4" w:color="D9D9D9"/>
-            </w:tcBorders>
-            <w:shd w:fill="FFFFFF"/>
-            <w:tcMar>
-              <w:top w:w="65" w:type="dxa"/>
-              <w:bottom w:w="65" w:type="dxa"/>
-              <w:left w:w="90" w:type="dxa"/>
-              <w:right w:w="90" w:type="dxa"/>
-            </w:tcMar>
-          </w:tcPr>
-          <w:p>
-            <w:pPr>
-              <w:spacing w:after="20" w:line="240" w:lineRule="auto"/>
-            </w:pPr>
-            <w:r>
-              <w:rPr>
-                <w:color w:val="000000"/>
-                <w:sz w:val="18"/>
-              </w:rPr>
-              <w:t>54–60</w:t>
-            </w:r>
-          </w:p>
-        </w:tc>
-        <w:tc>
-          <w:tcPr>
-            <w:tcW w:type="dxa" w:w="9029"/>
-            <w:tcBorders>
-              <w:top w:val="single" w:sz="4" w:color="D9D9D9"/>
-              <w:left w:val="single" w:sz="4" w:color="D9D9D9"/>
-              <w:bottom w:val="single" w:sz="4" w:color="D9D9D9"/>
-              <w:right w:val="single" w:sz="4" w:color="D9D9D9"/>
-            </w:tcBorders>
-            <w:shd w:fill="FFFFFF"/>
-            <w:tcMar>
-              <w:top w:w="65" w:type="dxa"/>
-              <w:bottom w:w="65" w:type="dxa"/>
-              <w:left w:w="90" w:type="dxa"/>
-              <w:right w:w="90" w:type="dxa"/>
-            </w:tcMar>
-          </w:tcPr>
-          <w:p>
-            <w:pPr>
-              <w:spacing w:after="20" w:line="240" w:lineRule="auto"/>
-            </w:pPr>
-            <w:r>
-              <w:rPr>
-                <w:color w:val="000000"/>
-                <w:sz w:val="18"/>
-              </w:rPr>
-              <w:t>Save and reset</w:t>
-            </w:r>
-          </w:p>
-        </w:tc>
-      </w:tr>
-    </w:tbl>
-    <w:p>
-      <w:pPr>
-        <w:spacing w:after="0"/>
-      </w:pPr>
-    </w:p>
-    <w:p>
-      <w:r>
-        <w:rPr>
-          <w:b/>
-        </w:rPr>
-        <w:t xml:space="preserve">Opening prompt </w:t>
-      </w:r>
-      <w:r>
         <w:t>Who could use your robot, and what would count as a useful result?</w:t>
       </w:r>
     </w:p>
@@ -10270,7 +10270,7 @@
         <w:t xml:space="preserve">1. </w:t>
       </w:r>
       <w:r>
-        <w:t>Complete the final four concept questions individually during minutes 0–7. Use the same questions as the baseline without looking at the earlier responses.</w:t>
+        <w:t>Complete the final four concept questions individually during minutes 0–7. These questions review concepts taught during the course; they are not a repeat of an opening test.</w:t>
       </w:r>
     </w:p>
     <w:p>
@@ -10355,7 +10355,7 @@
         <w:t xml:space="preserve">Expected reasoning </w:t>
       </w:r>
       <w:r>
-        <w:t>Use the same baseline key in the instructor guide. Report what actually happened during the demo, not the intended outcome. Future FRC interest is optional and separate from demonstrated learning.</w:t>
+        <w:t>Use the concept-question key in the instructor guide. Report what actually happened during the demo, not the intended outcome. Future FRC interest is optional and separate from demonstrated learning.</w:t>
       </w:r>
     </w:p>
     <w:p>
@@ -10372,7 +10372,7 @@
     </w:p>
     <w:p>
       <w:r>
-        <w:t>Use the same four questions at the start of week 1 and the start of week 8. Responses can be spoken, written, or indicated with accessible choices. Do not coach the final answers. Keep a team ID and a separate student ID so individual learning is visible.</w:t>
+        <w:t>Week 1 opens with a welcome and robot demonstration. Prior experience was already asked about; do not repeat it or ask beginners to rate their abilities. Mentors notice support needs while children build and try the robot. Use the following questions in Week 8 after the concepts have been taught. Responses can be spoken, written or indicated with accessible choices. Record support and student IDs privately.</w:t>
       </w:r>
     </w:p>
     <w:p>
@@ -10507,7 +10507,7 @@
     </w:p>
     <w:p>
       <w:r>
-        <w:t>Compare paired baseline and final responses only for students with both. Report the number of matched students, attendance, and language used. Improvements may reflect the program, previous experience, practice with the questions, and other learning. Do not claim causal proof from this small pilot.</w:t>
+        <w:t>Report attendance, dated examples of student work, mentor observations and the final demonstration. No opening concept test is collected, so do not calculate before-and-after score gains. Prior-experience information is context, not a substitute test score. Describe observed learning with its limits; do not claim causal proof from this small pilot.</w:t>
       </w:r>
     </w:p>
     <w:p>

</xml_diff>